<commit_message>
docs: regenerate report and recapture screenshots with revised numbering and footer
</commit_message>
<xml_diff>
--- a/DataSyncEngine-Relatorio.docx
+++ b/DataSyncEngine-Relatorio.docx
@@ -223,7 +223,7 @@
         <w:rPr>
           <w:noProof/>
         </w:rPr>
-        <w:t>Introdução</w:t>
+        <w:t>I. Introdução</w:t>
       </w:r>
       <w:r>
         <w:rPr>
@@ -241,7 +241,127 @@
         <w:rPr>
           <w:noProof/>
         </w:rPr>
-        <w:instrText xml:space="preserve"> PAGEREF _Toc242745133 \h </w:instrText>
+        <w:instrText xml:space="preserve"> PAGEREF _Toc242749266 \h </w:instrText>
+      </w:r>
+      <w:r>
+        <w:rPr>
+          <w:noProof/>
+        </w:rPr>
+      </w:r>
+      <w:r>
+        <w:rPr>
+          <w:noProof/>
+        </w:rPr>
+        <w:fldChar w:fldCharType="separate"/>
+      </w:r>
+      <w:r>
+        <w:rPr>
+          <w:noProof/>
+        </w:rPr>
+        <w:t>4</w:t>
+      </w:r>
+      <w:r>
+        <w:rPr>
+          <w:noProof/>
+        </w:rPr>
+        <w:fldChar w:fldCharType="end"/>
+      </w:r>
+    </w:p>
+    <w:p>
+      <w:pPr>
+        <w:pStyle w:val="TOC2"/>
+        <w:tabs>
+          <w:tab w:val="right" w:leader="dot" w:pos="9061"/>
+        </w:tabs>
+        <w:rPr>
+          <w:rFonts w:asciiTheme="minorHAnsi" w:eastAsiaTheme="minorEastAsia" w:hAnsiTheme="minorHAnsi" w:cstheme="minorBidi"/>
+          <w:noProof/>
+          <w:lang w:eastAsia="pt-PT"/>
+        </w:rPr>
+      </w:pPr>
+      <w:r>
+        <w:rPr>
+          <w:noProof/>
+        </w:rPr>
+        <w:t>1. Objetivos</w:t>
+      </w:r>
+      <w:r>
+        <w:rPr>
+          <w:noProof/>
+        </w:rPr>
+        <w:tab/>
+      </w:r>
+      <w:r>
+        <w:rPr>
+          <w:noProof/>
+        </w:rPr>
+        <w:fldChar w:fldCharType="begin"/>
+      </w:r>
+      <w:r>
+        <w:rPr>
+          <w:noProof/>
+        </w:rPr>
+        <w:instrText xml:space="preserve"> PAGEREF _Toc242749267 \h </w:instrText>
+      </w:r>
+      <w:r>
+        <w:rPr>
+          <w:noProof/>
+        </w:rPr>
+      </w:r>
+      <w:r>
+        <w:rPr>
+          <w:noProof/>
+        </w:rPr>
+        <w:fldChar w:fldCharType="separate"/>
+      </w:r>
+      <w:r>
+        <w:rPr>
+          <w:noProof/>
+        </w:rPr>
+        <w:t>4</w:t>
+      </w:r>
+      <w:r>
+        <w:rPr>
+          <w:noProof/>
+        </w:rPr>
+        <w:fldChar w:fldCharType="end"/>
+      </w:r>
+    </w:p>
+    <w:p>
+      <w:pPr>
+        <w:pStyle w:val="TOC2"/>
+        <w:tabs>
+          <w:tab w:val="right" w:leader="dot" w:pos="9061"/>
+        </w:tabs>
+        <w:rPr>
+          <w:rFonts w:asciiTheme="minorHAnsi" w:eastAsiaTheme="minorEastAsia" w:hAnsiTheme="minorHAnsi" w:cstheme="minorBidi"/>
+          <w:noProof/>
+          <w:lang w:eastAsia="pt-PT"/>
+        </w:rPr>
+      </w:pPr>
+      <w:r>
+        <w:rPr>
+          <w:noProof/>
+        </w:rPr>
+        <w:t>2. Estrutura do relatório</w:t>
+      </w:r>
+      <w:r>
+        <w:rPr>
+          <w:noProof/>
+        </w:rPr>
+        <w:tab/>
+      </w:r>
+      <w:r>
+        <w:rPr>
+          <w:noProof/>
+        </w:rPr>
+        <w:fldChar w:fldCharType="begin"/>
+      </w:r>
+      <w:r>
+        <w:rPr>
+          <w:noProof/>
+        </w:rPr>
+        <w:instrText xml:space="preserve"> PAGEREF _Toc242749268 \h </w:instrText>
       </w:r>
       <w:r>
         <w:rPr>
@@ -284,7 +404,7 @@
         <w:rPr>
           <w:noProof/>
         </w:rPr>
-        <w:t>Objectivos</w:t>
+        <w:t>II. Revisão Bibliográfica</w:t>
       </w:r>
       <w:r>
         <w:rPr>
@@ -302,7 +422,7 @@
         <w:rPr>
           <w:noProof/>
         </w:rPr>
-        <w:instrText xml:space="preserve"> PAGEREF _Toc242745134 \h </w:instrText>
+        <w:instrText xml:space="preserve"> PAGEREF _Toc242749269 \h </w:instrText>
       </w:r>
       <w:r>
         <w:rPr>
@@ -344,7 +464,7 @@
         <w:rPr>
           <w:noProof/>
         </w:rPr>
-        <w:t>Objectivo Geral</w:t>
+        <w:t>1. Sincronização de dados</w:t>
       </w:r>
       <w:r>
         <w:rPr>
@@ -362,7 +482,127 @@
         <w:rPr>
           <w:noProof/>
         </w:rPr>
-        <w:instrText xml:space="preserve"> PAGEREF _Toc242745135 \h </w:instrText>
+        <w:instrText xml:space="preserve"> PAGEREF _Toc242749270 \h </w:instrText>
+      </w:r>
+      <w:r>
+        <w:rPr>
+          <w:noProof/>
+        </w:rPr>
+      </w:r>
+      <w:r>
+        <w:rPr>
+          <w:noProof/>
+        </w:rPr>
+        <w:fldChar w:fldCharType="separate"/>
+      </w:r>
+      <w:r>
+        <w:rPr>
+          <w:noProof/>
+        </w:rPr>
+        <w:t>5</w:t>
+      </w:r>
+      <w:r>
+        <w:rPr>
+          <w:noProof/>
+        </w:rPr>
+        <w:fldChar w:fldCharType="end"/>
+      </w:r>
+    </w:p>
+    <w:p>
+      <w:pPr>
+        <w:pStyle w:val="TOC3"/>
+        <w:tabs>
+          <w:tab w:val="right" w:leader="dot" w:pos="9061"/>
+        </w:tabs>
+        <w:rPr>
+          <w:rFonts w:asciiTheme="minorHAnsi" w:eastAsiaTheme="minorEastAsia" w:hAnsiTheme="minorHAnsi" w:cstheme="minorBidi"/>
+          <w:noProof/>
+          <w:lang w:eastAsia="pt-PT"/>
+        </w:rPr>
+      </w:pPr>
+      <w:r>
+        <w:rPr>
+          <w:noProof/>
+        </w:rPr>
+        <w:t>1.1 Principais abordagens</w:t>
+      </w:r>
+      <w:r>
+        <w:rPr>
+          <w:noProof/>
+        </w:rPr>
+        <w:tab/>
+      </w:r>
+      <w:r>
+        <w:rPr>
+          <w:noProof/>
+        </w:rPr>
+        <w:fldChar w:fldCharType="begin"/>
+      </w:r>
+      <w:r>
+        <w:rPr>
+          <w:noProof/>
+        </w:rPr>
+        <w:instrText xml:space="preserve"> PAGEREF _Toc242749271 \h </w:instrText>
+      </w:r>
+      <w:r>
+        <w:rPr>
+          <w:noProof/>
+        </w:rPr>
+      </w:r>
+      <w:r>
+        <w:rPr>
+          <w:noProof/>
+        </w:rPr>
+        <w:fldChar w:fldCharType="separate"/>
+      </w:r>
+      <w:r>
+        <w:rPr>
+          <w:noProof/>
+        </w:rPr>
+        <w:t>5</w:t>
+      </w:r>
+      <w:r>
+        <w:rPr>
+          <w:noProof/>
+        </w:rPr>
+        <w:fldChar w:fldCharType="end"/>
+      </w:r>
+    </w:p>
+    <w:p>
+      <w:pPr>
+        <w:pStyle w:val="TOC3"/>
+        <w:tabs>
+          <w:tab w:val="right" w:leader="dot" w:pos="9061"/>
+        </w:tabs>
+        <w:rPr>
+          <w:rFonts w:asciiTheme="minorHAnsi" w:eastAsiaTheme="minorEastAsia" w:hAnsiTheme="minorHAnsi" w:cstheme="minorBidi"/>
+          <w:noProof/>
+          <w:lang w:eastAsia="pt-PT"/>
+        </w:rPr>
+      </w:pPr>
+      <w:r>
+        <w:rPr>
+          <w:noProof/>
+        </w:rPr>
+        <w:t>1.2 Fiabilidade da transmissão</w:t>
+      </w:r>
+      <w:r>
+        <w:rPr>
+          <w:noProof/>
+        </w:rPr>
+        <w:tab/>
+      </w:r>
+      <w:r>
+        <w:rPr>
+          <w:noProof/>
+        </w:rPr>
+        <w:fldChar w:fldCharType="begin"/>
+      </w:r>
+      <w:r>
+        <w:rPr>
+          <w:noProof/>
+        </w:rPr>
+        <w:instrText xml:space="preserve"> PAGEREF _Toc242749272 \h </w:instrText>
       </w:r>
       <w:r>
         <w:rPr>
@@ -404,7 +644,7 @@
         <w:rPr>
           <w:noProof/>
         </w:rPr>
-        <w:t>Objectivos Específicos</w:t>
+        <w:t>2. Segurança da informação</w:t>
       </w:r>
       <w:r>
         <w:rPr>
@@ -422,7 +662,7 @@
         <w:rPr>
           <w:noProof/>
         </w:rPr>
-        <w:instrText xml:space="preserve"> PAGEREF _Toc242745136 \h </w:instrText>
+        <w:instrText xml:space="preserve"> PAGEREF _Toc242749273 \h </w:instrText>
       </w:r>
       <w:r>
         <w:rPr>
@@ -440,6 +680,186 @@
           <w:noProof/>
         </w:rPr>
         <w:t>5</w:t>
+      </w:r>
+      <w:r>
+        <w:rPr>
+          <w:noProof/>
+        </w:rPr>
+        <w:fldChar w:fldCharType="end"/>
+      </w:r>
+    </w:p>
+    <w:p>
+      <w:pPr>
+        <w:pStyle w:val="TOC3"/>
+        <w:tabs>
+          <w:tab w:val="right" w:leader="dot" w:pos="9061"/>
+        </w:tabs>
+        <w:rPr>
+          <w:rFonts w:asciiTheme="minorHAnsi" w:eastAsiaTheme="minorEastAsia" w:hAnsiTheme="minorHAnsi" w:cstheme="minorBidi"/>
+          <w:noProof/>
+          <w:lang w:eastAsia="pt-PT"/>
+        </w:rPr>
+      </w:pPr>
+      <w:r>
+        <w:rPr>
+          <w:noProof/>
+        </w:rPr>
+        <w:t>2.1 Autenticação</w:t>
+      </w:r>
+      <w:r>
+        <w:rPr>
+          <w:noProof/>
+        </w:rPr>
+        <w:tab/>
+      </w:r>
+      <w:r>
+        <w:rPr>
+          <w:noProof/>
+        </w:rPr>
+        <w:fldChar w:fldCharType="begin"/>
+      </w:r>
+      <w:r>
+        <w:rPr>
+          <w:noProof/>
+        </w:rPr>
+        <w:instrText xml:space="preserve"> PAGEREF _Toc242749274 \h </w:instrText>
+      </w:r>
+      <w:r>
+        <w:rPr>
+          <w:noProof/>
+        </w:rPr>
+      </w:r>
+      <w:r>
+        <w:rPr>
+          <w:noProof/>
+        </w:rPr>
+        <w:fldChar w:fldCharType="separate"/>
+      </w:r>
+      <w:r>
+        <w:rPr>
+          <w:noProof/>
+        </w:rPr>
+        <w:t>5</w:t>
+      </w:r>
+      <w:r>
+        <w:rPr>
+          <w:noProof/>
+        </w:rPr>
+        <w:fldChar w:fldCharType="end"/>
+      </w:r>
+    </w:p>
+    <w:p>
+      <w:pPr>
+        <w:pStyle w:val="TOC3"/>
+        <w:tabs>
+          <w:tab w:val="right" w:leader="dot" w:pos="9061"/>
+        </w:tabs>
+        <w:rPr>
+          <w:rFonts w:asciiTheme="minorHAnsi" w:eastAsiaTheme="minorEastAsia" w:hAnsiTheme="minorHAnsi" w:cstheme="minorBidi"/>
+          <w:noProof/>
+          <w:lang w:eastAsia="pt-PT"/>
+        </w:rPr>
+      </w:pPr>
+      <w:r>
+        <w:rPr>
+          <w:noProof/>
+        </w:rPr>
+        <w:t>2.2 Encriptação</w:t>
+      </w:r>
+      <w:r>
+        <w:rPr>
+          <w:noProof/>
+        </w:rPr>
+        <w:tab/>
+      </w:r>
+      <w:r>
+        <w:rPr>
+          <w:noProof/>
+        </w:rPr>
+        <w:fldChar w:fldCharType="begin"/>
+      </w:r>
+      <w:r>
+        <w:rPr>
+          <w:noProof/>
+        </w:rPr>
+        <w:instrText xml:space="preserve"> PAGEREF _Toc242749275 \h </w:instrText>
+      </w:r>
+      <w:r>
+        <w:rPr>
+          <w:noProof/>
+        </w:rPr>
+      </w:r>
+      <w:r>
+        <w:rPr>
+          <w:noProof/>
+        </w:rPr>
+        <w:fldChar w:fldCharType="separate"/>
+      </w:r>
+      <w:r>
+        <w:rPr>
+          <w:noProof/>
+        </w:rPr>
+        <w:t>6</w:t>
+      </w:r>
+      <w:r>
+        <w:rPr>
+          <w:noProof/>
+        </w:rPr>
+        <w:fldChar w:fldCharType="end"/>
+      </w:r>
+    </w:p>
+    <w:p>
+      <w:pPr>
+        <w:pStyle w:val="TOC2"/>
+        <w:tabs>
+          <w:tab w:val="right" w:leader="dot" w:pos="9061"/>
+        </w:tabs>
+        <w:rPr>
+          <w:rFonts w:asciiTheme="minorHAnsi" w:eastAsiaTheme="minorEastAsia" w:hAnsiTheme="minorHAnsi" w:cstheme="minorBidi"/>
+          <w:noProof/>
+          <w:lang w:eastAsia="pt-PT"/>
+        </w:rPr>
+      </w:pPr>
+      <w:r>
+        <w:rPr>
+          <w:noProof/>
+        </w:rPr>
+        <w:t>3. Tecnologias utilizadas</w:t>
+      </w:r>
+      <w:r>
+        <w:rPr>
+          <w:noProof/>
+        </w:rPr>
+        <w:tab/>
+      </w:r>
+      <w:r>
+        <w:rPr>
+          <w:noProof/>
+        </w:rPr>
+        <w:fldChar w:fldCharType="begin"/>
+      </w:r>
+      <w:r>
+        <w:rPr>
+          <w:noProof/>
+        </w:rPr>
+        <w:instrText xml:space="preserve"> PAGEREF _Toc242749276 \h </w:instrText>
+      </w:r>
+      <w:r>
+        <w:rPr>
+          <w:noProof/>
+        </w:rPr>
+      </w:r>
+      <w:r>
+        <w:rPr>
+          <w:noProof/>
+        </w:rPr>
+        <w:fldChar w:fldCharType="separate"/>
+      </w:r>
+      <w:r>
+        <w:rPr>
+          <w:noProof/>
+        </w:rPr>
+        <w:t>6</w:t>
       </w:r>
       <w:r>
         <w:rPr>
@@ -465,7 +885,7 @@
         <w:rPr>
           <w:noProof/>
         </w:rPr>
-        <w:t>Revisão Bibliográfica</w:t>
+        <w:t>III. Desenvolvimento</w:t>
       </w:r>
       <w:r>
         <w:rPr>
@@ -483,7 +903,7 @@
         <w:rPr>
           <w:noProof/>
         </w:rPr>
-        <w:instrText xml:space="preserve"> PAGEREF _Toc242745137 \h </w:instrText>
+        <w:instrText xml:space="preserve"> PAGEREF _Toc242749277 \h </w:instrText>
       </w:r>
       <w:r>
         <w:rPr>
@@ -500,7 +920,7 @@
         <w:rPr>
           <w:noProof/>
         </w:rPr>
-        <w:t>6</w:t>
+        <w:t>7</w:t>
       </w:r>
       <w:r>
         <w:rPr>
@@ -525,7 +945,7 @@
         <w:rPr>
           <w:noProof/>
         </w:rPr>
-        <w:t>Sincronização de Dados</w:t>
+        <w:t>1. Arquitetura da solução</w:t>
       </w:r>
       <w:r>
         <w:rPr>
@@ -543,7 +963,7 @@
         <w:rPr>
           <w:noProof/>
         </w:rPr>
-        <w:instrText xml:space="preserve"> PAGEREF _Toc242745138 \h </w:instrText>
+        <w:instrText xml:space="preserve"> PAGEREF _Toc242749278 \h </w:instrText>
       </w:r>
       <w:r>
         <w:rPr>
@@ -560,7 +980,7 @@
         <w:rPr>
           <w:noProof/>
         </w:rPr>
-        <w:t>6</w:t>
+        <w:t>7</w:t>
       </w:r>
       <w:r>
         <w:rPr>
@@ -585,7 +1005,7 @@
         <w:rPr>
           <w:noProof/>
         </w:rPr>
-        <w:t>Estratégias de Cópia de Segurança</w:t>
+        <w:t>2. Autenticação e arranque</w:t>
       </w:r>
       <w:r>
         <w:rPr>
@@ -603,7 +1023,7 @@
         <w:rPr>
           <w:noProof/>
         </w:rPr>
-        <w:instrText xml:space="preserve"> PAGEREF _Toc242745139 \h </w:instrText>
+        <w:instrText xml:space="preserve"> PAGEREF _Toc242749279 \h </w:instrText>
       </w:r>
       <w:r>
         <w:rPr>
@@ -620,7 +1040,7 @@
         <w:rPr>
           <w:noProof/>
         </w:rPr>
-        <w:t>6</w:t>
+        <w:t>7</w:t>
       </w:r>
       <w:r>
         <w:rPr>
@@ -645,7 +1065,7 @@
         <w:rPr>
           <w:noProof/>
         </w:rPr>
-        <w:t>Tecnologias Utilizadas</w:t>
+        <w:t>3. Interface principal</w:t>
       </w:r>
       <w:r>
         <w:rPr>
@@ -663,7 +1083,7 @@
         <w:rPr>
           <w:noProof/>
         </w:rPr>
-        <w:instrText xml:space="preserve"> PAGEREF _Toc242745140 \h </w:instrText>
+        <w:instrText xml:space="preserve"> PAGEREF _Toc242749280 \h </w:instrText>
       </w:r>
       <w:r>
         <w:rPr>
@@ -680,7 +1100,7 @@
         <w:rPr>
           <w:noProof/>
         </w:rPr>
-        <w:t>6</w:t>
+        <w:t>9</w:t>
       </w:r>
       <w:r>
         <w:rPr>
@@ -705,7 +1125,7 @@
         <w:rPr>
           <w:noProof/>
         </w:rPr>
-        <w:t>Segurança e Auditoria</w:t>
+        <w:t>4. Sincronização</w:t>
       </w:r>
       <w:r>
         <w:rPr>
@@ -723,7 +1143,7 @@
         <w:rPr>
           <w:noProof/>
         </w:rPr>
-        <w:instrText xml:space="preserve"> PAGEREF _Toc242745141 \h </w:instrText>
+        <w:instrText xml:space="preserve"> PAGEREF _Toc242749281 \h </w:instrText>
       </w:r>
       <w:r>
         <w:rPr>
@@ -740,7 +1160,547 @@
         <w:rPr>
           <w:noProof/>
         </w:rPr>
-        <w:t>7</w:t>
+        <w:t>9</w:t>
+      </w:r>
+      <w:r>
+        <w:rPr>
+          <w:noProof/>
+        </w:rPr>
+        <w:fldChar w:fldCharType="end"/>
+      </w:r>
+    </w:p>
+    <w:p>
+      <w:pPr>
+        <w:pStyle w:val="TOC2"/>
+        <w:tabs>
+          <w:tab w:val="right" w:leader="dot" w:pos="9061"/>
+        </w:tabs>
+        <w:rPr>
+          <w:rFonts w:asciiTheme="minorHAnsi" w:eastAsiaTheme="minorEastAsia" w:hAnsiTheme="minorHAnsi" w:cstheme="minorBidi"/>
+          <w:noProof/>
+          <w:lang w:eastAsia="pt-PT"/>
+        </w:rPr>
+      </w:pPr>
+      <w:r>
+        <w:rPr>
+          <w:noProof/>
+        </w:rPr>
+        <w:t>5. Cópias de segurança</w:t>
+      </w:r>
+      <w:r>
+        <w:rPr>
+          <w:noProof/>
+        </w:rPr>
+        <w:tab/>
+      </w:r>
+      <w:r>
+        <w:rPr>
+          <w:noProof/>
+        </w:rPr>
+        <w:fldChar w:fldCharType="begin"/>
+      </w:r>
+      <w:r>
+        <w:rPr>
+          <w:noProof/>
+        </w:rPr>
+        <w:instrText xml:space="preserve"> PAGEREF _Toc242749282 \h </w:instrText>
+      </w:r>
+      <w:r>
+        <w:rPr>
+          <w:noProof/>
+        </w:rPr>
+      </w:r>
+      <w:r>
+        <w:rPr>
+          <w:noProof/>
+        </w:rPr>
+        <w:fldChar w:fldCharType="separate"/>
+      </w:r>
+      <w:r>
+        <w:rPr>
+          <w:noProof/>
+        </w:rPr>
+        <w:t>10</w:t>
+      </w:r>
+      <w:r>
+        <w:rPr>
+          <w:noProof/>
+        </w:rPr>
+        <w:fldChar w:fldCharType="end"/>
+      </w:r>
+    </w:p>
+    <w:p>
+      <w:pPr>
+        <w:pStyle w:val="TOC2"/>
+        <w:tabs>
+          <w:tab w:val="right" w:leader="dot" w:pos="9061"/>
+        </w:tabs>
+        <w:rPr>
+          <w:rFonts w:asciiTheme="minorHAnsi" w:eastAsiaTheme="minorEastAsia" w:hAnsiTheme="minorHAnsi" w:cstheme="minorBidi"/>
+          <w:noProof/>
+          <w:lang w:eastAsia="pt-PT"/>
+        </w:rPr>
+      </w:pPr>
+      <w:r>
+        <w:rPr>
+          <w:noProof/>
+        </w:rPr>
+        <w:t>6. Reciclagem</w:t>
+      </w:r>
+      <w:r>
+        <w:rPr>
+          <w:noProof/>
+        </w:rPr>
+        <w:tab/>
+      </w:r>
+      <w:r>
+        <w:rPr>
+          <w:noProof/>
+        </w:rPr>
+        <w:fldChar w:fldCharType="begin"/>
+      </w:r>
+      <w:r>
+        <w:rPr>
+          <w:noProof/>
+        </w:rPr>
+        <w:instrText xml:space="preserve"> PAGEREF _Toc242749283 \h </w:instrText>
+      </w:r>
+      <w:r>
+        <w:rPr>
+          <w:noProof/>
+        </w:rPr>
+      </w:r>
+      <w:r>
+        <w:rPr>
+          <w:noProof/>
+        </w:rPr>
+        <w:fldChar w:fldCharType="separate"/>
+      </w:r>
+      <w:r>
+        <w:rPr>
+          <w:noProof/>
+        </w:rPr>
+        <w:t>10</w:t>
+      </w:r>
+      <w:r>
+        <w:rPr>
+          <w:noProof/>
+        </w:rPr>
+        <w:fldChar w:fldCharType="end"/>
+      </w:r>
+    </w:p>
+    <w:p>
+      <w:pPr>
+        <w:pStyle w:val="TOC2"/>
+        <w:tabs>
+          <w:tab w:val="right" w:leader="dot" w:pos="9061"/>
+        </w:tabs>
+        <w:rPr>
+          <w:rFonts w:asciiTheme="minorHAnsi" w:eastAsiaTheme="minorEastAsia" w:hAnsiTheme="minorHAnsi" w:cstheme="minorBidi"/>
+          <w:noProof/>
+          <w:lang w:eastAsia="pt-PT"/>
+        </w:rPr>
+      </w:pPr>
+      <w:r>
+        <w:rPr>
+          <w:noProof/>
+        </w:rPr>
+        <w:t>7. Servidores</w:t>
+      </w:r>
+      <w:r>
+        <w:rPr>
+          <w:noProof/>
+        </w:rPr>
+        <w:tab/>
+      </w:r>
+      <w:r>
+        <w:rPr>
+          <w:noProof/>
+        </w:rPr>
+        <w:fldChar w:fldCharType="begin"/>
+      </w:r>
+      <w:r>
+        <w:rPr>
+          <w:noProof/>
+        </w:rPr>
+        <w:instrText xml:space="preserve"> PAGEREF _Toc242749284 \h </w:instrText>
+      </w:r>
+      <w:r>
+        <w:rPr>
+          <w:noProof/>
+        </w:rPr>
+      </w:r>
+      <w:r>
+        <w:rPr>
+          <w:noProof/>
+        </w:rPr>
+        <w:fldChar w:fldCharType="separate"/>
+      </w:r>
+      <w:r>
+        <w:rPr>
+          <w:noProof/>
+        </w:rPr>
+        <w:t>11</w:t>
+      </w:r>
+      <w:r>
+        <w:rPr>
+          <w:noProof/>
+        </w:rPr>
+        <w:fldChar w:fldCharType="end"/>
+      </w:r>
+    </w:p>
+    <w:p>
+      <w:pPr>
+        <w:pStyle w:val="TOC2"/>
+        <w:tabs>
+          <w:tab w:val="right" w:leader="dot" w:pos="9061"/>
+        </w:tabs>
+        <w:rPr>
+          <w:rFonts w:asciiTheme="minorHAnsi" w:eastAsiaTheme="minorEastAsia" w:hAnsiTheme="minorHAnsi" w:cstheme="minorBidi"/>
+          <w:noProof/>
+          <w:lang w:eastAsia="pt-PT"/>
+        </w:rPr>
+      </w:pPr>
+      <w:r>
+        <w:rPr>
+          <w:noProof/>
+        </w:rPr>
+        <w:t>8. Auditoria</w:t>
+      </w:r>
+      <w:r>
+        <w:rPr>
+          <w:noProof/>
+        </w:rPr>
+        <w:tab/>
+      </w:r>
+      <w:r>
+        <w:rPr>
+          <w:noProof/>
+        </w:rPr>
+        <w:fldChar w:fldCharType="begin"/>
+      </w:r>
+      <w:r>
+        <w:rPr>
+          <w:noProof/>
+        </w:rPr>
+        <w:instrText xml:space="preserve"> PAGEREF _Toc242749285 \h </w:instrText>
+      </w:r>
+      <w:r>
+        <w:rPr>
+          <w:noProof/>
+        </w:rPr>
+      </w:r>
+      <w:r>
+        <w:rPr>
+          <w:noProof/>
+        </w:rPr>
+        <w:fldChar w:fldCharType="separate"/>
+      </w:r>
+      <w:r>
+        <w:rPr>
+          <w:noProof/>
+        </w:rPr>
+        <w:t>11</w:t>
+      </w:r>
+      <w:r>
+        <w:rPr>
+          <w:noProof/>
+        </w:rPr>
+        <w:fldChar w:fldCharType="end"/>
+      </w:r>
+    </w:p>
+    <w:p>
+      <w:pPr>
+        <w:pStyle w:val="TOC2"/>
+        <w:tabs>
+          <w:tab w:val="right" w:leader="dot" w:pos="9061"/>
+        </w:tabs>
+        <w:rPr>
+          <w:rFonts w:asciiTheme="minorHAnsi" w:eastAsiaTheme="minorEastAsia" w:hAnsiTheme="minorHAnsi" w:cstheme="minorBidi"/>
+          <w:noProof/>
+          <w:lang w:eastAsia="pt-PT"/>
+        </w:rPr>
+      </w:pPr>
+      <w:r>
+        <w:rPr>
+          <w:noProof/>
+        </w:rPr>
+        <w:t>9. Estatísticas</w:t>
+      </w:r>
+      <w:r>
+        <w:rPr>
+          <w:noProof/>
+        </w:rPr>
+        <w:tab/>
+      </w:r>
+      <w:r>
+        <w:rPr>
+          <w:noProof/>
+        </w:rPr>
+        <w:fldChar w:fldCharType="begin"/>
+      </w:r>
+      <w:r>
+        <w:rPr>
+          <w:noProof/>
+        </w:rPr>
+        <w:instrText xml:space="preserve"> PAGEREF _Toc242749286 \h </w:instrText>
+      </w:r>
+      <w:r>
+        <w:rPr>
+          <w:noProof/>
+        </w:rPr>
+      </w:r>
+      <w:r>
+        <w:rPr>
+          <w:noProof/>
+        </w:rPr>
+        <w:fldChar w:fldCharType="separate"/>
+      </w:r>
+      <w:r>
+        <w:rPr>
+          <w:noProof/>
+        </w:rPr>
+        <w:t>12</w:t>
+      </w:r>
+      <w:r>
+        <w:rPr>
+          <w:noProof/>
+        </w:rPr>
+        <w:fldChar w:fldCharType="end"/>
+      </w:r>
+    </w:p>
+    <w:p>
+      <w:pPr>
+        <w:pStyle w:val="TOC2"/>
+        <w:tabs>
+          <w:tab w:val="right" w:leader="dot" w:pos="9061"/>
+        </w:tabs>
+        <w:rPr>
+          <w:rFonts w:asciiTheme="minorHAnsi" w:eastAsiaTheme="minorEastAsia" w:hAnsiTheme="minorHAnsi" w:cstheme="minorBidi"/>
+          <w:noProof/>
+          <w:lang w:eastAsia="pt-PT"/>
+        </w:rPr>
+      </w:pPr>
+      <w:r>
+        <w:rPr>
+          <w:noProof/>
+        </w:rPr>
+        <w:t>10. Utilizadores</w:t>
+      </w:r>
+      <w:r>
+        <w:rPr>
+          <w:noProof/>
+        </w:rPr>
+        <w:tab/>
+      </w:r>
+      <w:r>
+        <w:rPr>
+          <w:noProof/>
+        </w:rPr>
+        <w:fldChar w:fldCharType="begin"/>
+      </w:r>
+      <w:r>
+        <w:rPr>
+          <w:noProof/>
+        </w:rPr>
+        <w:instrText xml:space="preserve"> PAGEREF _Toc242749287 \h </w:instrText>
+      </w:r>
+      <w:r>
+        <w:rPr>
+          <w:noProof/>
+        </w:rPr>
+      </w:r>
+      <w:r>
+        <w:rPr>
+          <w:noProof/>
+        </w:rPr>
+        <w:fldChar w:fldCharType="separate"/>
+      </w:r>
+      <w:r>
+        <w:rPr>
+          <w:noProof/>
+        </w:rPr>
+        <w:t>12</w:t>
+      </w:r>
+      <w:r>
+        <w:rPr>
+          <w:noProof/>
+        </w:rPr>
+        <w:fldChar w:fldCharType="end"/>
+      </w:r>
+    </w:p>
+    <w:p>
+      <w:pPr>
+        <w:pStyle w:val="TOC2"/>
+        <w:tabs>
+          <w:tab w:val="right" w:leader="dot" w:pos="9061"/>
+        </w:tabs>
+        <w:rPr>
+          <w:rFonts w:asciiTheme="minorHAnsi" w:eastAsiaTheme="minorEastAsia" w:hAnsiTheme="minorHAnsi" w:cstheme="minorBidi"/>
+          <w:noProof/>
+          <w:lang w:eastAsia="pt-PT"/>
+        </w:rPr>
+      </w:pPr>
+      <w:r>
+        <w:rPr>
+          <w:noProof/>
+        </w:rPr>
+        <w:t>11. Definições</w:t>
+      </w:r>
+      <w:r>
+        <w:rPr>
+          <w:noProof/>
+        </w:rPr>
+        <w:tab/>
+      </w:r>
+      <w:r>
+        <w:rPr>
+          <w:noProof/>
+        </w:rPr>
+        <w:fldChar w:fldCharType="begin"/>
+      </w:r>
+      <w:r>
+        <w:rPr>
+          <w:noProof/>
+        </w:rPr>
+        <w:instrText xml:space="preserve"> PAGEREF _Toc242749288 \h </w:instrText>
+      </w:r>
+      <w:r>
+        <w:rPr>
+          <w:noProof/>
+        </w:rPr>
+      </w:r>
+      <w:r>
+        <w:rPr>
+          <w:noProof/>
+        </w:rPr>
+        <w:fldChar w:fldCharType="separate"/>
+      </w:r>
+      <w:r>
+        <w:rPr>
+          <w:noProof/>
+        </w:rPr>
+        <w:t>13</w:t>
+      </w:r>
+      <w:r>
+        <w:rPr>
+          <w:noProof/>
+        </w:rPr>
+        <w:fldChar w:fldCharType="end"/>
+      </w:r>
+    </w:p>
+    <w:p>
+      <w:pPr>
+        <w:pStyle w:val="TOC2"/>
+        <w:tabs>
+          <w:tab w:val="right" w:leader="dot" w:pos="9061"/>
+        </w:tabs>
+        <w:rPr>
+          <w:rFonts w:asciiTheme="minorHAnsi" w:eastAsiaTheme="minorEastAsia" w:hAnsiTheme="minorHAnsi" w:cstheme="minorBidi"/>
+          <w:noProof/>
+          <w:lang w:eastAsia="pt-PT"/>
+        </w:rPr>
+      </w:pPr>
+      <w:r>
+        <w:rPr>
+          <w:noProof/>
+        </w:rPr>
+        <w:t>12. Diálogos e configurações adicionais</w:t>
+      </w:r>
+      <w:r>
+        <w:rPr>
+          <w:noProof/>
+        </w:rPr>
+        <w:tab/>
+      </w:r>
+      <w:r>
+        <w:rPr>
+          <w:noProof/>
+        </w:rPr>
+        <w:fldChar w:fldCharType="begin"/>
+      </w:r>
+      <w:r>
+        <w:rPr>
+          <w:noProof/>
+        </w:rPr>
+        <w:instrText xml:space="preserve"> PAGEREF _Toc242749289 \h </w:instrText>
+      </w:r>
+      <w:r>
+        <w:rPr>
+          <w:noProof/>
+        </w:rPr>
+      </w:r>
+      <w:r>
+        <w:rPr>
+          <w:noProof/>
+        </w:rPr>
+        <w:fldChar w:fldCharType="separate"/>
+      </w:r>
+      <w:r>
+        <w:rPr>
+          <w:noProof/>
+        </w:rPr>
+        <w:t>13</w:t>
+      </w:r>
+      <w:r>
+        <w:rPr>
+          <w:noProof/>
+        </w:rPr>
+        <w:fldChar w:fldCharType="end"/>
+      </w:r>
+    </w:p>
+    <w:p>
+      <w:pPr>
+        <w:pStyle w:val="TOC2"/>
+        <w:tabs>
+          <w:tab w:val="right" w:leader="dot" w:pos="9061"/>
+        </w:tabs>
+        <w:rPr>
+          <w:rFonts w:asciiTheme="minorHAnsi" w:eastAsiaTheme="minorEastAsia" w:hAnsiTheme="minorHAnsi" w:cstheme="minorBidi"/>
+          <w:noProof/>
+          <w:lang w:eastAsia="pt-PT"/>
+        </w:rPr>
+      </w:pPr>
+      <w:r>
+        <w:rPr>
+          <w:noProof/>
+        </w:rPr>
+        <w:t>13. Dados protegidos e exploração de ficheiros</w:t>
+      </w:r>
+      <w:r>
+        <w:rPr>
+          <w:noProof/>
+        </w:rPr>
+        <w:tab/>
+      </w:r>
+      <w:r>
+        <w:rPr>
+          <w:noProof/>
+        </w:rPr>
+        <w:fldChar w:fldCharType="begin"/>
+      </w:r>
+      <w:r>
+        <w:rPr>
+          <w:noProof/>
+        </w:rPr>
+        <w:instrText xml:space="preserve"> PAGEREF _Toc242749290 \h </w:instrText>
+      </w:r>
+      <w:r>
+        <w:rPr>
+          <w:noProof/>
+        </w:rPr>
+      </w:r>
+      <w:r>
+        <w:rPr>
+          <w:noProof/>
+        </w:rPr>
+        <w:fldChar w:fldCharType="separate"/>
+      </w:r>
+      <w:r>
+        <w:rPr>
+          <w:noProof/>
+        </w:rPr>
+        <w:t>16</w:t>
       </w:r>
       <w:r>
         <w:rPr>
@@ -766,7 +1726,7 @@
         <w:rPr>
           <w:noProof/>
         </w:rPr>
-        <w:t>Desenvolvimento</w:t>
+        <w:t>IV. Conclusão</w:t>
       </w:r>
       <w:r>
         <w:rPr>
@@ -784,7 +1744,7 @@
         <w:rPr>
           <w:noProof/>
         </w:rPr>
-        <w:instrText xml:space="preserve"> PAGEREF _Toc242745142 \h </w:instrText>
+        <w:instrText xml:space="preserve"> PAGEREF _Toc242749291 \h </w:instrText>
       </w:r>
       <w:r>
         <w:rPr>
@@ -801,907 +1761,7 @@
         <w:rPr>
           <w:noProof/>
         </w:rPr>
-        <w:t>8</w:t>
-      </w:r>
-      <w:r>
-        <w:rPr>
-          <w:noProof/>
-        </w:rPr>
-        <w:fldChar w:fldCharType="end"/>
-      </w:r>
-    </w:p>
-    <w:p>
-      <w:pPr>
-        <w:pStyle w:val="TOC2"/>
-        <w:tabs>
-          <w:tab w:val="right" w:leader="dot" w:pos="9061"/>
-        </w:tabs>
-        <w:rPr>
-          <w:rFonts w:asciiTheme="minorHAnsi" w:eastAsiaTheme="minorEastAsia" w:hAnsiTheme="minorHAnsi" w:cstheme="minorBidi"/>
-          <w:noProof/>
-          <w:lang w:eastAsia="pt-PT"/>
-        </w:rPr>
-      </w:pPr>
-      <w:r>
-        <w:rPr>
-          <w:noProof/>
-        </w:rPr>
-        <w:t>Arquitetura do Sistema</w:t>
-      </w:r>
-      <w:r>
-        <w:rPr>
-          <w:noProof/>
-        </w:rPr>
-        <w:tab/>
-      </w:r>
-      <w:r>
-        <w:rPr>
-          <w:noProof/>
-        </w:rPr>
-        <w:fldChar w:fldCharType="begin"/>
-      </w:r>
-      <w:r>
-        <w:rPr>
-          <w:noProof/>
-        </w:rPr>
-        <w:instrText xml:space="preserve"> PAGEREF _Toc242745143 \h </w:instrText>
-      </w:r>
-      <w:r>
-        <w:rPr>
-          <w:noProof/>
-        </w:rPr>
-      </w:r>
-      <w:r>
-        <w:rPr>
-          <w:noProof/>
-        </w:rPr>
-        <w:fldChar w:fldCharType="separate"/>
-      </w:r>
-      <w:r>
-        <w:rPr>
-          <w:noProof/>
-        </w:rPr>
-        <w:t>8</w:t>
-      </w:r>
-      <w:r>
-        <w:rPr>
-          <w:noProof/>
-        </w:rPr>
-        <w:fldChar w:fldCharType="end"/>
-      </w:r>
-    </w:p>
-    <w:p>
-      <w:pPr>
-        <w:pStyle w:val="TOC2"/>
-        <w:tabs>
-          <w:tab w:val="right" w:leader="dot" w:pos="9061"/>
-        </w:tabs>
-        <w:rPr>
-          <w:rFonts w:asciiTheme="minorHAnsi" w:eastAsiaTheme="minorEastAsia" w:hAnsiTheme="minorHAnsi" w:cstheme="minorBidi"/>
-          <w:noProof/>
-          <w:lang w:eastAsia="pt-PT"/>
-        </w:rPr>
-      </w:pPr>
-      <w:r>
-        <w:rPr>
-          <w:noProof/>
-        </w:rPr>
-        <w:t>Tecnologias e Ferramentas</w:t>
-      </w:r>
-      <w:r>
-        <w:rPr>
-          <w:noProof/>
-        </w:rPr>
-        <w:tab/>
-      </w:r>
-      <w:r>
-        <w:rPr>
-          <w:noProof/>
-        </w:rPr>
-        <w:fldChar w:fldCharType="begin"/>
-      </w:r>
-      <w:r>
-        <w:rPr>
-          <w:noProof/>
-        </w:rPr>
-        <w:instrText xml:space="preserve"> PAGEREF _Toc242745144 \h </w:instrText>
-      </w:r>
-      <w:r>
-        <w:rPr>
-          <w:noProof/>
-        </w:rPr>
-      </w:r>
-      <w:r>
-        <w:rPr>
-          <w:noProof/>
-        </w:rPr>
-        <w:fldChar w:fldCharType="separate"/>
-      </w:r>
-      <w:r>
-        <w:rPr>
-          <w:noProof/>
-        </w:rPr>
-        <w:t>8</w:t>
-      </w:r>
-      <w:r>
-        <w:rPr>
-          <w:noProof/>
-        </w:rPr>
-        <w:fldChar w:fldCharType="end"/>
-      </w:r>
-    </w:p>
-    <w:p>
-      <w:pPr>
-        <w:pStyle w:val="TOC2"/>
-        <w:tabs>
-          <w:tab w:val="right" w:leader="dot" w:pos="9061"/>
-        </w:tabs>
-        <w:rPr>
-          <w:rFonts w:asciiTheme="minorHAnsi" w:eastAsiaTheme="minorEastAsia" w:hAnsiTheme="minorHAnsi" w:cstheme="minorBidi"/>
-          <w:noProof/>
-          <w:lang w:eastAsia="pt-PT"/>
-        </w:rPr>
-      </w:pPr>
-      <w:r>
-        <w:rPr>
-          <w:noProof/>
-        </w:rPr>
-        <w:t>Interface e Experiência de Utilizador</w:t>
-      </w:r>
-      <w:r>
-        <w:rPr>
-          <w:noProof/>
-        </w:rPr>
-        <w:tab/>
-      </w:r>
-      <w:r>
-        <w:rPr>
-          <w:noProof/>
-        </w:rPr>
-        <w:fldChar w:fldCharType="begin"/>
-      </w:r>
-      <w:r>
-        <w:rPr>
-          <w:noProof/>
-        </w:rPr>
-        <w:instrText xml:space="preserve"> PAGEREF _Toc242745145 \h </w:instrText>
-      </w:r>
-      <w:r>
-        <w:rPr>
-          <w:noProof/>
-        </w:rPr>
-      </w:r>
-      <w:r>
-        <w:rPr>
-          <w:noProof/>
-        </w:rPr>
-        <w:fldChar w:fldCharType="separate"/>
-      </w:r>
-      <w:r>
-        <w:rPr>
-          <w:noProof/>
-        </w:rPr>
-        <w:t>8</w:t>
-      </w:r>
-      <w:r>
-        <w:rPr>
-          <w:noProof/>
-        </w:rPr>
-        <w:fldChar w:fldCharType="end"/>
-      </w:r>
-    </w:p>
-    <w:p>
-      <w:pPr>
-        <w:pStyle w:val="TOC2"/>
-        <w:tabs>
-          <w:tab w:val="right" w:leader="dot" w:pos="9061"/>
-        </w:tabs>
-        <w:rPr>
-          <w:rFonts w:asciiTheme="minorHAnsi" w:eastAsiaTheme="minorEastAsia" w:hAnsiTheme="minorHAnsi" w:cstheme="minorBidi"/>
-          <w:noProof/>
-          <w:lang w:eastAsia="pt-PT"/>
-        </w:rPr>
-      </w:pPr>
-      <w:r>
-        <w:rPr>
-          <w:noProof/>
-        </w:rPr>
-        <w:t>Módulos Funcionais</w:t>
-      </w:r>
-      <w:r>
-        <w:rPr>
-          <w:noProof/>
-        </w:rPr>
-        <w:tab/>
-      </w:r>
-      <w:r>
-        <w:rPr>
-          <w:noProof/>
-        </w:rPr>
-        <w:fldChar w:fldCharType="begin"/>
-      </w:r>
-      <w:r>
-        <w:rPr>
-          <w:noProof/>
-        </w:rPr>
-        <w:instrText xml:space="preserve"> PAGEREF _Toc242745146 \h </w:instrText>
-      </w:r>
-      <w:r>
-        <w:rPr>
-          <w:noProof/>
-        </w:rPr>
-      </w:r>
-      <w:r>
-        <w:rPr>
-          <w:noProof/>
-        </w:rPr>
-        <w:fldChar w:fldCharType="separate"/>
-      </w:r>
-      <w:r>
-        <w:rPr>
-          <w:noProof/>
-        </w:rPr>
-        <w:t>10</w:t>
-      </w:r>
-      <w:r>
-        <w:rPr>
-          <w:noProof/>
-        </w:rPr>
-        <w:fldChar w:fldCharType="end"/>
-      </w:r>
-    </w:p>
-    <w:p>
-      <w:pPr>
-        <w:pStyle w:val="TOC3"/>
-        <w:tabs>
-          <w:tab w:val="right" w:leader="dot" w:pos="9061"/>
-        </w:tabs>
-        <w:rPr>
-          <w:rFonts w:asciiTheme="minorHAnsi" w:eastAsiaTheme="minorEastAsia" w:hAnsiTheme="minorHAnsi" w:cstheme="minorBidi"/>
-          <w:noProof/>
-          <w:lang w:eastAsia="pt-PT"/>
-        </w:rPr>
-      </w:pPr>
-      <w:r>
-        <w:rPr>
-          <w:noProof/>
-        </w:rPr>
-        <w:t>Arranque e Autenticação</w:t>
-      </w:r>
-      <w:r>
-        <w:rPr>
-          <w:noProof/>
-        </w:rPr>
-        <w:tab/>
-      </w:r>
-      <w:r>
-        <w:rPr>
-          <w:noProof/>
-        </w:rPr>
-        <w:fldChar w:fldCharType="begin"/>
-      </w:r>
-      <w:r>
-        <w:rPr>
-          <w:noProof/>
-        </w:rPr>
-        <w:instrText xml:space="preserve"> PAGEREF _Toc242745147 \h </w:instrText>
-      </w:r>
-      <w:r>
-        <w:rPr>
-          <w:noProof/>
-        </w:rPr>
-      </w:r>
-      <w:r>
-        <w:rPr>
-          <w:noProof/>
-        </w:rPr>
-        <w:fldChar w:fldCharType="separate"/>
-      </w:r>
-      <w:r>
-        <w:rPr>
-          <w:noProof/>
-        </w:rPr>
-        <w:t>10</w:t>
-      </w:r>
-      <w:r>
-        <w:rPr>
-          <w:noProof/>
-        </w:rPr>
-        <w:fldChar w:fldCharType="end"/>
-      </w:r>
-    </w:p>
-    <w:p>
-      <w:pPr>
-        <w:pStyle w:val="TOC3"/>
-        <w:tabs>
-          <w:tab w:val="right" w:leader="dot" w:pos="9061"/>
-        </w:tabs>
-        <w:rPr>
-          <w:rFonts w:asciiTheme="minorHAnsi" w:eastAsiaTheme="minorEastAsia" w:hAnsiTheme="minorHAnsi" w:cstheme="minorBidi"/>
-          <w:noProof/>
-          <w:lang w:eastAsia="pt-PT"/>
-        </w:rPr>
-      </w:pPr>
-      <w:r>
-        <w:rPr>
-          <w:noProof/>
-        </w:rPr>
-        <w:t>Sincronização de Dados</w:t>
-      </w:r>
-      <w:r>
-        <w:rPr>
-          <w:noProof/>
-        </w:rPr>
-        <w:tab/>
-      </w:r>
-      <w:r>
-        <w:rPr>
-          <w:noProof/>
-        </w:rPr>
-        <w:fldChar w:fldCharType="begin"/>
-      </w:r>
-      <w:r>
-        <w:rPr>
-          <w:noProof/>
-        </w:rPr>
-        <w:instrText xml:space="preserve"> PAGEREF _Toc242745148 \h </w:instrText>
-      </w:r>
-      <w:r>
-        <w:rPr>
-          <w:noProof/>
-        </w:rPr>
-      </w:r>
-      <w:r>
-        <w:rPr>
-          <w:noProof/>
-        </w:rPr>
-        <w:fldChar w:fldCharType="separate"/>
-      </w:r>
-      <w:r>
-        <w:rPr>
-          <w:noProof/>
-        </w:rPr>
-        <w:t>11</w:t>
-      </w:r>
-      <w:r>
-        <w:rPr>
-          <w:noProof/>
-        </w:rPr>
-        <w:fldChar w:fldCharType="end"/>
-      </w:r>
-    </w:p>
-    <w:p>
-      <w:pPr>
-        <w:pStyle w:val="TOC3"/>
-        <w:tabs>
-          <w:tab w:val="right" w:leader="dot" w:pos="9061"/>
-        </w:tabs>
-        <w:rPr>
-          <w:rFonts w:asciiTheme="minorHAnsi" w:eastAsiaTheme="minorEastAsia" w:hAnsiTheme="minorHAnsi" w:cstheme="minorBidi"/>
-          <w:noProof/>
-          <w:lang w:eastAsia="pt-PT"/>
-        </w:rPr>
-      </w:pPr>
-      <w:r>
-        <w:rPr>
-          <w:noProof/>
-        </w:rPr>
-        <w:t>Cópia de Segurança</w:t>
-      </w:r>
-      <w:r>
-        <w:rPr>
-          <w:noProof/>
-        </w:rPr>
-        <w:tab/>
-      </w:r>
-      <w:r>
-        <w:rPr>
-          <w:noProof/>
-        </w:rPr>
-        <w:fldChar w:fldCharType="begin"/>
-      </w:r>
-      <w:r>
-        <w:rPr>
-          <w:noProof/>
-        </w:rPr>
-        <w:instrText xml:space="preserve"> PAGEREF _Toc242745149 \h </w:instrText>
-      </w:r>
-      <w:r>
-        <w:rPr>
-          <w:noProof/>
-        </w:rPr>
-      </w:r>
-      <w:r>
-        <w:rPr>
-          <w:noProof/>
-        </w:rPr>
-        <w:fldChar w:fldCharType="separate"/>
-      </w:r>
-      <w:r>
-        <w:rPr>
-          <w:noProof/>
-        </w:rPr>
-        <w:t>11</w:t>
-      </w:r>
-      <w:r>
-        <w:rPr>
-          <w:noProof/>
-        </w:rPr>
-        <w:fldChar w:fldCharType="end"/>
-      </w:r>
-    </w:p>
-    <w:p>
-      <w:pPr>
-        <w:pStyle w:val="TOC3"/>
-        <w:tabs>
-          <w:tab w:val="right" w:leader="dot" w:pos="9061"/>
-        </w:tabs>
-        <w:rPr>
-          <w:rFonts w:asciiTheme="minorHAnsi" w:eastAsiaTheme="minorEastAsia" w:hAnsiTheme="minorHAnsi" w:cstheme="minorBidi"/>
-          <w:noProof/>
-          <w:lang w:eastAsia="pt-PT"/>
-        </w:rPr>
-      </w:pPr>
-      <w:r>
-        <w:rPr>
-          <w:noProof/>
-        </w:rPr>
-        <w:t>Reciclagem</w:t>
-      </w:r>
-      <w:r>
-        <w:rPr>
-          <w:noProof/>
-        </w:rPr>
-        <w:tab/>
-      </w:r>
-      <w:r>
-        <w:rPr>
-          <w:noProof/>
-        </w:rPr>
-        <w:fldChar w:fldCharType="begin"/>
-      </w:r>
-      <w:r>
-        <w:rPr>
-          <w:noProof/>
-        </w:rPr>
-        <w:instrText xml:space="preserve"> PAGEREF _Toc242745150 \h </w:instrText>
-      </w:r>
-      <w:r>
-        <w:rPr>
-          <w:noProof/>
-        </w:rPr>
-      </w:r>
-      <w:r>
-        <w:rPr>
-          <w:noProof/>
-        </w:rPr>
-        <w:fldChar w:fldCharType="separate"/>
-      </w:r>
-      <w:r>
-        <w:rPr>
-          <w:noProof/>
-        </w:rPr>
-        <w:t>12</w:t>
-      </w:r>
-      <w:r>
-        <w:rPr>
-          <w:noProof/>
-        </w:rPr>
-        <w:fldChar w:fldCharType="end"/>
-      </w:r>
-    </w:p>
-    <w:p>
-      <w:pPr>
-        <w:pStyle w:val="TOC3"/>
-        <w:tabs>
-          <w:tab w:val="right" w:leader="dot" w:pos="9061"/>
-        </w:tabs>
-        <w:rPr>
-          <w:rFonts w:asciiTheme="minorHAnsi" w:eastAsiaTheme="minorEastAsia" w:hAnsiTheme="minorHAnsi" w:cstheme="minorBidi"/>
-          <w:noProof/>
-          <w:lang w:eastAsia="pt-PT"/>
-        </w:rPr>
-      </w:pPr>
-      <w:r>
-        <w:rPr>
-          <w:noProof/>
-        </w:rPr>
-        <w:t>Gestão de Servidores</w:t>
-      </w:r>
-      <w:r>
-        <w:rPr>
-          <w:noProof/>
-        </w:rPr>
-        <w:tab/>
-      </w:r>
-      <w:r>
-        <w:rPr>
-          <w:noProof/>
-        </w:rPr>
-        <w:fldChar w:fldCharType="begin"/>
-      </w:r>
-      <w:r>
-        <w:rPr>
-          <w:noProof/>
-        </w:rPr>
-        <w:instrText xml:space="preserve"> PAGEREF _Toc242745151 \h </w:instrText>
-      </w:r>
-      <w:r>
-        <w:rPr>
-          <w:noProof/>
-        </w:rPr>
-      </w:r>
-      <w:r>
-        <w:rPr>
-          <w:noProof/>
-        </w:rPr>
-        <w:fldChar w:fldCharType="separate"/>
-      </w:r>
-      <w:r>
-        <w:rPr>
-          <w:noProof/>
-        </w:rPr>
-        <w:t>12</w:t>
-      </w:r>
-      <w:r>
-        <w:rPr>
-          <w:noProof/>
-        </w:rPr>
-        <w:fldChar w:fldCharType="end"/>
-      </w:r>
-    </w:p>
-    <w:p>
-      <w:pPr>
-        <w:pStyle w:val="TOC3"/>
-        <w:tabs>
-          <w:tab w:val="right" w:leader="dot" w:pos="9061"/>
-        </w:tabs>
-        <w:rPr>
-          <w:rFonts w:asciiTheme="minorHAnsi" w:eastAsiaTheme="minorEastAsia" w:hAnsiTheme="minorHAnsi" w:cstheme="minorBidi"/>
-          <w:noProof/>
-          <w:lang w:eastAsia="pt-PT"/>
-        </w:rPr>
-      </w:pPr>
-      <w:r>
-        <w:rPr>
-          <w:noProof/>
-        </w:rPr>
-        <w:t>Auditoria</w:t>
-      </w:r>
-      <w:r>
-        <w:rPr>
-          <w:noProof/>
-        </w:rPr>
-        <w:tab/>
-      </w:r>
-      <w:r>
-        <w:rPr>
-          <w:noProof/>
-        </w:rPr>
-        <w:fldChar w:fldCharType="begin"/>
-      </w:r>
-      <w:r>
-        <w:rPr>
-          <w:noProof/>
-        </w:rPr>
-        <w:instrText xml:space="preserve"> PAGEREF _Toc242745152 \h </w:instrText>
-      </w:r>
-      <w:r>
-        <w:rPr>
-          <w:noProof/>
-        </w:rPr>
-      </w:r>
-      <w:r>
-        <w:rPr>
-          <w:noProof/>
-        </w:rPr>
-        <w:fldChar w:fldCharType="separate"/>
-      </w:r>
-      <w:r>
-        <w:rPr>
-          <w:noProof/>
-        </w:rPr>
-        <w:t>13</w:t>
-      </w:r>
-      <w:r>
-        <w:rPr>
-          <w:noProof/>
-        </w:rPr>
-        <w:fldChar w:fldCharType="end"/>
-      </w:r>
-    </w:p>
-    <w:p>
-      <w:pPr>
-        <w:pStyle w:val="TOC3"/>
-        <w:tabs>
-          <w:tab w:val="right" w:leader="dot" w:pos="9061"/>
-        </w:tabs>
-        <w:rPr>
-          <w:rFonts w:asciiTheme="minorHAnsi" w:eastAsiaTheme="minorEastAsia" w:hAnsiTheme="minorHAnsi" w:cstheme="minorBidi"/>
-          <w:noProof/>
-          <w:lang w:eastAsia="pt-PT"/>
-        </w:rPr>
-      </w:pPr>
-      <w:r>
-        <w:rPr>
-          <w:noProof/>
-        </w:rPr>
-        <w:t>Estatísticas</w:t>
-      </w:r>
-      <w:r>
-        <w:rPr>
-          <w:noProof/>
-        </w:rPr>
-        <w:tab/>
-      </w:r>
-      <w:r>
-        <w:rPr>
-          <w:noProof/>
-        </w:rPr>
-        <w:fldChar w:fldCharType="begin"/>
-      </w:r>
-      <w:r>
-        <w:rPr>
-          <w:noProof/>
-        </w:rPr>
-        <w:instrText xml:space="preserve"> PAGEREF _Toc242745153 \h </w:instrText>
-      </w:r>
-      <w:r>
-        <w:rPr>
-          <w:noProof/>
-        </w:rPr>
-      </w:r>
-      <w:r>
-        <w:rPr>
-          <w:noProof/>
-        </w:rPr>
-        <w:fldChar w:fldCharType="separate"/>
-      </w:r>
-      <w:r>
-        <w:rPr>
-          <w:noProof/>
-        </w:rPr>
-        <w:t>14</w:t>
-      </w:r>
-      <w:r>
-        <w:rPr>
-          <w:noProof/>
-        </w:rPr>
-        <w:fldChar w:fldCharType="end"/>
-      </w:r>
-    </w:p>
-    <w:p>
-      <w:pPr>
-        <w:pStyle w:val="TOC3"/>
-        <w:tabs>
-          <w:tab w:val="right" w:leader="dot" w:pos="9061"/>
-        </w:tabs>
-        <w:rPr>
-          <w:rFonts w:asciiTheme="minorHAnsi" w:eastAsiaTheme="minorEastAsia" w:hAnsiTheme="minorHAnsi" w:cstheme="minorBidi"/>
-          <w:noProof/>
-          <w:lang w:eastAsia="pt-PT"/>
-        </w:rPr>
-      </w:pPr>
-      <w:r>
-        <w:rPr>
-          <w:noProof/>
-        </w:rPr>
-        <w:t>Gestão de Utilizadores</w:t>
-      </w:r>
-      <w:r>
-        <w:rPr>
-          <w:noProof/>
-        </w:rPr>
-        <w:tab/>
-      </w:r>
-      <w:r>
-        <w:rPr>
-          <w:noProof/>
-        </w:rPr>
-        <w:fldChar w:fldCharType="begin"/>
-      </w:r>
-      <w:r>
-        <w:rPr>
-          <w:noProof/>
-        </w:rPr>
-        <w:instrText xml:space="preserve"> PAGEREF _Toc242745154 \h </w:instrText>
-      </w:r>
-      <w:r>
-        <w:rPr>
-          <w:noProof/>
-        </w:rPr>
-      </w:r>
-      <w:r>
-        <w:rPr>
-          <w:noProof/>
-        </w:rPr>
-        <w:fldChar w:fldCharType="separate"/>
-      </w:r>
-      <w:r>
-        <w:rPr>
-          <w:noProof/>
-        </w:rPr>
-        <w:t>14</w:t>
-      </w:r>
-      <w:r>
-        <w:rPr>
-          <w:noProof/>
-        </w:rPr>
-        <w:fldChar w:fldCharType="end"/>
-      </w:r>
-    </w:p>
-    <w:p>
-      <w:pPr>
-        <w:pStyle w:val="TOC3"/>
-        <w:tabs>
-          <w:tab w:val="right" w:leader="dot" w:pos="9061"/>
-        </w:tabs>
-        <w:rPr>
-          <w:rFonts w:asciiTheme="minorHAnsi" w:eastAsiaTheme="minorEastAsia" w:hAnsiTheme="minorHAnsi" w:cstheme="minorBidi"/>
-          <w:noProof/>
-          <w:lang w:eastAsia="pt-PT"/>
-        </w:rPr>
-      </w:pPr>
-      <w:r>
-        <w:rPr>
-          <w:noProof/>
-        </w:rPr>
-        <w:t>Configurações</w:t>
-      </w:r>
-      <w:r>
-        <w:rPr>
-          <w:noProof/>
-        </w:rPr>
-        <w:tab/>
-      </w:r>
-      <w:r>
-        <w:rPr>
-          <w:noProof/>
-        </w:rPr>
-        <w:fldChar w:fldCharType="begin"/>
-      </w:r>
-      <w:r>
-        <w:rPr>
-          <w:noProof/>
-        </w:rPr>
-        <w:instrText xml:space="preserve"> PAGEREF _Toc242745155 \h </w:instrText>
-      </w:r>
-      <w:r>
-        <w:rPr>
-          <w:noProof/>
-        </w:rPr>
-      </w:r>
-      <w:r>
-        <w:rPr>
-          <w:noProof/>
-        </w:rPr>
-        <w:fldChar w:fldCharType="separate"/>
-      </w:r>
-      <w:r>
-        <w:rPr>
-          <w:noProof/>
-        </w:rPr>
-        <w:t>16</w:t>
-      </w:r>
-      <w:r>
-        <w:rPr>
-          <w:noProof/>
-        </w:rPr>
-        <w:fldChar w:fldCharType="end"/>
-      </w:r>
-    </w:p>
-    <w:p>
-      <w:pPr>
-        <w:pStyle w:val="TOC3"/>
-        <w:tabs>
-          <w:tab w:val="right" w:leader="dot" w:pos="9061"/>
-        </w:tabs>
-        <w:rPr>
-          <w:rFonts w:asciiTheme="minorHAnsi" w:eastAsiaTheme="minorEastAsia" w:hAnsiTheme="minorHAnsi" w:cstheme="minorBidi"/>
-          <w:noProof/>
-          <w:lang w:eastAsia="pt-PT"/>
-        </w:rPr>
-      </w:pPr>
-      <w:r>
-        <w:rPr>
-          <w:noProof/>
-        </w:rPr>
-        <w:t>Explorador de Ficheiros</w:t>
-      </w:r>
-      <w:r>
-        <w:rPr>
-          <w:noProof/>
-        </w:rPr>
-        <w:tab/>
-      </w:r>
-      <w:r>
-        <w:rPr>
-          <w:noProof/>
-        </w:rPr>
-        <w:fldChar w:fldCharType="begin"/>
-      </w:r>
-      <w:r>
-        <w:rPr>
-          <w:noProof/>
-        </w:rPr>
-        <w:instrText xml:space="preserve"> PAGEREF _Toc242745156 \h </w:instrText>
-      </w:r>
-      <w:r>
-        <w:rPr>
-          <w:noProof/>
-        </w:rPr>
-      </w:r>
-      <w:r>
-        <w:rPr>
-          <w:noProof/>
-        </w:rPr>
-        <w:fldChar w:fldCharType="separate"/>
-      </w:r>
-      <w:r>
-        <w:rPr>
-          <w:noProof/>
-        </w:rPr>
-        <w:t>17</w:t>
-      </w:r>
-      <w:r>
-        <w:rPr>
-          <w:noProof/>
-        </w:rPr>
-        <w:fldChar w:fldCharType="end"/>
-      </w:r>
-    </w:p>
-    <w:p>
-      <w:pPr>
-        <w:pStyle w:val="TOC3"/>
-        <w:tabs>
-          <w:tab w:val="right" w:leader="dot" w:pos="9061"/>
-        </w:tabs>
-        <w:rPr>
-          <w:rFonts w:asciiTheme="minorHAnsi" w:eastAsiaTheme="minorEastAsia" w:hAnsiTheme="minorHAnsi" w:cstheme="minorBidi"/>
-          <w:noProof/>
-          <w:lang w:eastAsia="pt-PT"/>
-        </w:rPr>
-      </w:pPr>
-      <w:r>
-        <w:rPr>
-          <w:noProof/>
-        </w:rPr>
-        <w:t>Diálogos Auxiliares</w:t>
-      </w:r>
-      <w:r>
-        <w:rPr>
-          <w:noProof/>
-        </w:rPr>
-        <w:tab/>
-      </w:r>
-      <w:r>
-        <w:rPr>
-          <w:noProof/>
-        </w:rPr>
-        <w:fldChar w:fldCharType="begin"/>
-      </w:r>
-      <w:r>
-        <w:rPr>
-          <w:noProof/>
-        </w:rPr>
-        <w:instrText xml:space="preserve"> PAGEREF _Toc242745157 \h </w:instrText>
-      </w:r>
-      <w:r>
-        <w:rPr>
-          <w:noProof/>
-        </w:rPr>
-      </w:r>
-      <w:r>
-        <w:rPr>
-          <w:noProof/>
-        </w:rPr>
-        <w:fldChar w:fldCharType="separate"/>
-      </w:r>
-      <w:r>
-        <w:rPr>
-          <w:noProof/>
-        </w:rPr>
-        <w:t>17</w:t>
+        <w:t>19</w:t>
       </w:r>
       <w:r>
         <w:rPr>
@@ -1727,7 +1787,7 @@
         <w:rPr>
           <w:noProof/>
         </w:rPr>
-        <w:t>Conclusão</w:t>
+        <w:t>Referências Bibliográficas</w:t>
       </w:r>
       <w:r>
         <w:rPr>
@@ -1745,68 +1805,7 @@
         <w:rPr>
           <w:noProof/>
         </w:rPr>
-        <w:instrText xml:space="preserve"> PAGEREF _Toc242745158 \h </w:instrText>
-      </w:r>
-      <w:r>
-        <w:rPr>
-          <w:noProof/>
-        </w:rPr>
-      </w:r>
-      <w:r>
-        <w:rPr>
-          <w:noProof/>
-        </w:rPr>
-        <w:fldChar w:fldCharType="separate"/>
-      </w:r>
-      <w:r>
-        <w:rPr>
-          <w:noProof/>
-        </w:rPr>
-        <w:t>19</w:t>
-      </w:r>
-      <w:r>
-        <w:rPr>
-          <w:noProof/>
-        </w:rPr>
-        <w:fldChar w:fldCharType="end"/>
-      </w:r>
-    </w:p>
-    <w:p>
-      <w:pPr>
-        <w:pStyle w:val="TOC1"/>
-        <w:tabs>
-          <w:tab w:val="right" w:leader="dot" w:pos="9061"/>
-        </w:tabs>
-        <w:rPr>
-          <w:rFonts w:asciiTheme="minorHAnsi" w:eastAsiaTheme="minorEastAsia" w:hAnsiTheme="minorHAnsi" w:cstheme="minorBidi"/>
-          <w:noProof/>
-          <w:sz w:val="22"/>
-          <w:lang w:eastAsia="pt-PT"/>
-        </w:rPr>
-      </w:pPr>
-      <w:r>
-        <w:rPr>
-          <w:noProof/>
-        </w:rPr>
-        <w:t>Referências Bibliográficas</w:t>
-      </w:r>
-      <w:r>
-        <w:rPr>
-          <w:noProof/>
-        </w:rPr>
-        <w:tab/>
-      </w:r>
-      <w:r>
-        <w:rPr>
-          <w:noProof/>
-        </w:rPr>
-        <w:fldChar w:fldCharType="begin"/>
-      </w:r>
-      <w:r>
-        <w:rPr>
-          <w:noProof/>
-        </w:rPr>
-        <w:instrText xml:space="preserve"> PAGEREF _Toc242745159 \h </w:instrText>
+        <w:instrText xml:space="preserve"> PAGEREF _Toc242749292 \h </w:instrText>
       </w:r>
       <w:r>
         <w:rPr>
@@ -1865,31 +1864,111 @@
       <w:pPr>
         <w:pStyle w:val="Heading1"/>
       </w:pPr>
-      <w:bookmarkStart w:id="0" w:name="_Toc242745133"/>
+      <w:bookmarkStart w:id="0" w:name="_Toc242749266"/>
       <w:r>
         <w:lastRenderedPageBreak/>
-        <w:t>Introdução</w:t>
+        <w:t>I. Introdução</w:t>
       </w:r>
       <w:bookmarkEnd w:id="0"/>
     </w:p>
     <w:p>
       <w:r>
-        <w:t>A evolução das tecnologias de informação conduziu a um aumento exponencial do volume de dados que as organizações produzem, armazenam e partilham diariamente. Neste contexto, garantir que a informação se mantém consistente e atualizada entre diferentes servidores e dispositivos tornou-se um dos principais desafios da engenharia de software. A sincronização manual é suscetível a erros, morosa e difícil de auditar, o que justifica a adoção de ferramentas automatizadas que reduzam o esforço humano e aumentem a fiabilidade das operações.</w:t>
-      </w:r>
-    </w:p>
-    <w:p>
-      <w:r>
-        <w:t>O presente relatório descreve o desenvolvimento do DataSyncEngine, uma aplicação de ambiente de trabalho concebida para sincronizar, gerir e salvaguardar ficheiros entre múltiplos servidores, oferecendo simultaneamente mecanismos de auditoria, controlo de acesso e recuperação de dados. O sistema foi pensado para responder às necessidades de pequenas e médias organizações que necessitam de manter réplicas de dados consistentes sem recorrer a infraestruturas complexas de computação em nuvem.</w:t>
-      </w:r>
-    </w:p>
-    <w:p>
-      <w:r>
-        <w:t>A motivação para a realização deste projeto assenta em três pilares: a necessidade de uma ferramenta simples e fiável para a sincronização de dados; a importância de garantir a rastreabilidade de todas as operações efetuadas sobre o sistema; e a vontade de aplicar, de forma integrada, os conhecimentos adquiridos ao longo da formação em programação, bases de dados, interfaces gráficas e segurança de sistemas.</w:t>
-      </w:r>
-    </w:p>
-    <w:p>
-      <w:r>
-        <w:t>O documento encontra-se estruturado da seguinte forma. Após esta introdução, apresentam-se os objetivos gerais e específicos que orientaram o desenvolvimento do projeto. Segue-se uma revisão bibliográfica sobre sincronização de dados, estratégias de cópia de segurança e as tecnologias utilizadas. Posteriormente, descreve-se o desenvolvimento do sistema, incluindo a arquitetura, as tecnologias e cada um dos módulos funcionais, ilustrados com capturas de ecrã da aplicação. Por fim, apresentam-se as conclusões e as referências bibliográficas que serviram de suporte ao trabalho.</w:t>
+        <w:t>A gestão de dados distribuídos exige que as cópias mantidas em servidores permaneçam, tanto quanto possível, idênticas. Em ambientes reais as alterações ocorrem em máquinas diferentes e em momentos distintos, pelo que a sua coordenação manual se torna impraticável. É neste contexto que surge o DataSyncEngine, uma aplicação de ambiente gráfico que automatiza a sincronização de ficheiros e de bases de dados entre servidores, com agendamento, cópias de segurança e registo integral das operações.</w:t>
+      </w:r>
+    </w:p>
+    <w:p>
+      <w:pPr>
+        <w:pStyle w:val="Heading2"/>
+      </w:pPr>
+      <w:bookmarkStart w:id="1" w:name="_Toc242749267"/>
+      <w:r>
+        <w:t>1. Objetivos</w:t>
+      </w:r>
+      <w:bookmarkEnd w:id="1"/>
+    </w:p>
+    <w:p>
+      <w:r>
+        <w:t>O trabalho visa o desenvolvimento de um sistema capaz de manter coerentes os dados de vários servidores, reduzindo o risco de perda e de inconsistência. Concretamente, pretende-se:</w:t>
+      </w:r>
+    </w:p>
+    <w:p>
+      <w:pPr>
+        <w:ind w:left="560" w:hanging="280"/>
+        <w:jc w:val="left"/>
+      </w:pPr>
+      <w:r>
+        <w:t>•</w:t>
+      </w:r>
+      <w:r>
+        <w:tab/>
+        <w:t>sincronizar ficheiros e dados entre servidores de forma automática e agendável;</w:t>
+      </w:r>
+    </w:p>
+    <w:p>
+      <w:pPr>
+        <w:ind w:left="560" w:hanging="280"/>
+        <w:jc w:val="left"/>
+      </w:pPr>
+      <w:r>
+        <w:t>•</w:t>
+      </w:r>
+      <w:r>
+        <w:tab/>
+        <w:t>garantir a segurança das operações através de autenticação e de encriptação;</w:t>
+      </w:r>
+    </w:p>
+    <w:p>
+      <w:pPr>
+        <w:ind w:left="560" w:hanging="280"/>
+        <w:jc w:val="left"/>
+      </w:pPr>
+      <w:r>
+        <w:t>•</w:t>
+      </w:r>
+      <w:r>
+        <w:tab/>
+        <w:t>criar cópias de segurança antes de cada sincronização;</w:t>
+      </w:r>
+    </w:p>
+    <w:p>
+      <w:pPr>
+        <w:ind w:left="560" w:hanging="280"/>
+        <w:jc w:val="left"/>
+      </w:pPr>
+      <w:r>
+        <w:t>•</w:t>
+      </w:r>
+      <w:r>
+        <w:tab/>
+        <w:t>recuperar ficheiros apagados através de uma área de reciclagem;</w:t>
+      </w:r>
+    </w:p>
+    <w:p>
+      <w:pPr>
+        <w:ind w:left="560" w:hanging="280"/>
+        <w:jc w:val="left"/>
+      </w:pPr>
+      <w:r>
+        <w:t>•</w:t>
+      </w:r>
+      <w:r>
+        <w:tab/>
+        <w:t>manter em auditoria um registo completo de todas as operações.</w:t>
+      </w:r>
+    </w:p>
+    <w:p>
+      <w:pPr>
+        <w:pStyle w:val="Heading2"/>
+      </w:pPr>
+      <w:bookmarkStart w:id="2" w:name="_Toc242749268"/>
+      <w:r>
+        <w:t>2. Estrutura do relatório</w:t>
+      </w:r>
+      <w:bookmarkEnd w:id="2"/>
+    </w:p>
+    <w:p>
+      <w:r>
+        <w:t>Este relatório encontra-se organizado em quatro capítulos. No capítulo I apresenta-se a introdução. No capítulo II é feita a revisão bibliográfica dos temas que enquadram o projeto. No capítulo III descreve-se o desenvolvimento da aplicação e, no capítulo IV, apresentam-se as conclusões.</w:t>
       </w:r>
     </w:p>
     <w:p>
@@ -1905,140 +1984,112 @@
       <w:pPr>
         <w:pStyle w:val="Heading1"/>
       </w:pPr>
-      <w:bookmarkStart w:id="1" w:name="_Toc242745134"/>
+      <w:bookmarkStart w:id="3" w:name="_Toc242749269"/>
       <w:r>
         <w:lastRenderedPageBreak/>
-        <w:t>Objectivos</w:t>
-      </w:r>
-      <w:bookmarkEnd w:id="1"/>
+        <w:t>II. Revisão Bibliográfica</w:t>
+      </w:r>
+      <w:bookmarkEnd w:id="3"/>
     </w:p>
     <w:p>
       <w:pPr>
         <w:pStyle w:val="Heading2"/>
       </w:pPr>
-      <w:bookmarkStart w:id="2" w:name="_Toc242745135"/>
-      <w:r>
-        <w:t>Objectivo Geral</w:t>
-      </w:r>
-      <w:bookmarkEnd w:id="2"/>
-    </w:p>
-    <w:p>
-      <w:r>
-        <w:t>Desenvolver uma aplicação de ambiente de trabalho, robusta e intuitiva, capaz de sincronizar, gerir e salvaguardar dados entre múltiplos servidores, integrando mecanismos de autenticação, auditoria, cópia de segurança e gestão de utilizadores, com uma interface gráfica moderna e consistente.</w:t>
+      <w:bookmarkStart w:id="4" w:name="_Toc242749270"/>
+      <w:r>
+        <w:t>1. Sincronização de dados</w:t>
+      </w:r>
+      <w:bookmarkEnd w:id="4"/>
+    </w:p>
+    <w:p>
+      <w:r>
+        <w:t>A sincronização de dados consiste em manter duas ou mais cópias da informação concordantes ao longo do tempo. No caso dos sistemas distribuídos, esta operação ganha relevo porque os dados deixam de residir num único repositório e passam a circular entre servidores. A necessidade de sincronizar decorre, sobretudo, de cenários em que determinada máquina fica indisponível e deve existir sempre uma cópia atualizada que garanta a continuidade do serviço.</w:t>
+      </w:r>
+    </w:p>
+    <w:p>
+      <w:pPr>
+        <w:pStyle w:val="Heading3"/>
+      </w:pPr>
+      <w:bookmarkStart w:id="5" w:name="_Toc242749271"/>
+      <w:r>
+        <w:t>1.1 Principais abordagens</w:t>
+      </w:r>
+      <w:bookmarkEnd w:id="5"/>
+    </w:p>
+    <w:p>
+      <w:r>
+        <w:t>Existem várias formas de encarar a sincronização. Quando a aplicação é o único produtor dos dados, a cópia pode ser feita de um só sentido. Já quando os dados são alterados em ambas as extremidades, é necessário conciliar as versões e resolver eventuais conflitos. Cabe ao desenho da solução decidir em que momentos a sincronização ocorre: por ordem do utilizador, em intervalos definidos ou quando se deteta uma alteração no conteúdo.</w:t>
+      </w:r>
+    </w:p>
+    <w:p>
+      <w:pPr>
+        <w:pStyle w:val="Heading3"/>
+      </w:pPr>
+      <w:bookmarkStart w:id="6" w:name="_Toc242749272"/>
+      <w:r>
+        <w:t>1.2 Fiabilidade da transmissão</w:t>
+      </w:r>
+      <w:bookmarkEnd w:id="6"/>
+    </w:p>
+    <w:p>
+      <w:r>
+        <w:t>O transporte dos dados entre servidores não é, por si só, suficiente. É preciso garantir que o ficheiro chega íntegro, que não existe duplicação desnecessária e que, em caso de falha, a operação possa ser retomada sem corromper o destino. Estas preocupações justificam a existência de cópias de segurança antes de cada operação e do registo detalhado de cada tentativa.</w:t>
       </w:r>
     </w:p>
     <w:p>
       <w:pPr>
         <w:pStyle w:val="Heading2"/>
       </w:pPr>
-      <w:bookmarkStart w:id="3" w:name="_Toc242745136"/>
-      <w:r>
-        <w:t>Objectivos Específicos</w:t>
-      </w:r>
-      <w:bookmarkEnd w:id="3"/>
-    </w:p>
-    <w:p>
-      <w:pPr>
-        <w:ind w:left="560" w:hanging="280"/>
-        <w:jc w:val="left"/>
-      </w:pPr>
-      <w:r>
-        <w:t>•</w:t>
-      </w:r>
-      <w:r>
-        <w:tab/>
-        <w:t>Implementar um sistema de autenticação de utilizadores com perfis de acesso diferenciados e bloqueio automático após tentativas de início de sessão falhadas.</w:t>
-      </w:r>
-    </w:p>
-    <w:p>
-      <w:pPr>
-        <w:ind w:left="560" w:hanging="280"/>
-        <w:jc w:val="left"/>
-      </w:pPr>
-      <w:r>
-        <w:t>•</w:t>
-      </w:r>
-      <w:r>
-        <w:tab/>
-        <w:t>Disponibilizar a sincronização de ficheiros entre um servidor local e servidores remotos, com estimativa de tempo, barra de progresso e deteção de alterações.</w:t>
-      </w:r>
-    </w:p>
-    <w:p>
-      <w:pPr>
-        <w:ind w:left="560" w:hanging="280"/>
-        <w:jc w:val="left"/>
-      </w:pPr>
-      <w:r>
-        <w:t>•</w:t>
-      </w:r>
-      <w:r>
-        <w:tab/>
-        <w:t>Criar mecanismos de cópia de segurança automática e manual, incluindo exportação de dados para formatos interoperáveis.</w:t>
-      </w:r>
-    </w:p>
-    <w:p>
-      <w:pPr>
-        <w:ind w:left="560" w:hanging="280"/>
-        <w:jc w:val="left"/>
-      </w:pPr>
-      <w:r>
-        <w:t>•</w:t>
-      </w:r>
-      <w:r>
-        <w:tab/>
-        <w:t>Desenvolver um módulo de auditoria que registe, de forma cronológica, todas as operações relevantes realizadas sobre o sistema, com filtragem e exportação.</w:t>
-      </w:r>
-    </w:p>
-    <w:p>
-      <w:pPr>
-        <w:ind w:left="560" w:hanging="280"/>
-        <w:jc w:val="left"/>
-      </w:pPr>
-      <w:r>
-        <w:t>•</w:t>
-      </w:r>
-      <w:r>
-        <w:tab/>
-        <w:t>Implementar a gestão completa de utilizadores, servidores e configurações, incluindo a alteração e a reposição de palavras-passe.</w:t>
-      </w:r>
-    </w:p>
-    <w:p>
-      <w:pPr>
-        <w:ind w:left="560" w:hanging="280"/>
-        <w:jc w:val="left"/>
-      </w:pPr>
-      <w:r>
-        <w:t>•</w:t>
-      </w:r>
-      <w:r>
-        <w:tab/>
-        <w:t>Garantir a segurança dos dados sensíveis através de uma chave-mestra e da cifragem das credenciais de acesso aos servidores.</w:t>
-      </w:r>
-    </w:p>
-    <w:p>
-      <w:pPr>
-        <w:ind w:left="560" w:hanging="280"/>
-        <w:jc w:val="left"/>
-      </w:pPr>
-      <w:r>
-        <w:t>•</w:t>
-      </w:r>
-      <w:r>
-        <w:tab/>
-        <w:t>Conceber uma interface gráfica moderna, inspirada em plataformas web de referência, com navegação lateral e temas claro e escuro.</w:t>
-      </w:r>
-    </w:p>
-    <w:p>
-      <w:pPr>
-        <w:ind w:left="560" w:hanging="280"/>
-        <w:jc w:val="left"/>
-      </w:pPr>
-      <w:r>
-        <w:t>•</w:t>
-      </w:r>
-      <w:r>
-        <w:tab/>
-        <w:t>Assegurar a persistência de dados numa base de dados relacional e a integridade das operações através de transações.</w:t>
+      <w:bookmarkStart w:id="7" w:name="_Toc242749273"/>
+      <w:r>
+        <w:t>2. Segurança da informação</w:t>
+      </w:r>
+      <w:bookmarkEnd w:id="7"/>
+    </w:p>
+    <w:p>
+      <w:pPr>
+        <w:pStyle w:val="Heading3"/>
+      </w:pPr>
+      <w:bookmarkStart w:id="8" w:name="_Toc242749274"/>
+      <w:r>
+        <w:t>2.1 Autenticação</w:t>
+      </w:r>
+      <w:bookmarkEnd w:id="8"/>
+    </w:p>
+    <w:p>
+      <w:r>
+        <w:t>Qualquer sistema que manipule dados sensíveis deve limitar o acesso às funcionalidades mediante autenticação. Num ambiente multiusuário convém ainda distinguir perfis, atribuindo a cada utilizador apenas as permissões necessárias às suas funções. O bloqueio automático da sessão após períodos de inatividade é uma medida complementar que impede o uso indevido de sessões abertas.</w:t>
+      </w:r>
+    </w:p>
+    <w:p>
+      <w:pPr>
+        <w:pStyle w:val="Heading3"/>
+      </w:pPr>
+      <w:bookmarkStart w:id="9" w:name="_Toc242749275"/>
+      <w:r>
+        <w:lastRenderedPageBreak/>
+        <w:t>2.2 Encriptação</w:t>
+      </w:r>
+      <w:bookmarkEnd w:id="9"/>
+    </w:p>
+    <w:p>
+      <w:r>
+        <w:t>A encriptação protege os dados tanto na transmissão como no armazenamento. Chaves mestras e palavras-passe cifradas impedem que a informação seja legível mesmo que alguém aceda ao suporte físico onde reside. A gestão cuidada das chaves é, contudo, tão importante quanto a encriptação em si, pois de pouco serve cifrar se as chaves ficarem acessíveis.</w:t>
+      </w:r>
+    </w:p>
+    <w:p>
+      <w:pPr>
+        <w:pStyle w:val="Heading2"/>
+      </w:pPr>
+      <w:bookmarkStart w:id="10" w:name="_Toc242749276"/>
+      <w:r>
+        <w:t>3. Tecnologias utilizadas</w:t>
+      </w:r>
+      <w:bookmarkEnd w:id="10"/>
+    </w:p>
+    <w:p>
+      <w:r>
+        <w:t>Para a implementação foi utilizado o framework .NET com a plataforma Windows Forms, que permite criar interfaces ricas em ambiente Windows de forma produtiva. O conjunto de controlos Krypton foi empregue para obter uma aparência coerente e ajustável, incluindo o modo de tema escuro. Como suporte de armazenamento dos dados da aplicação optou-se por um sistema de gestão de base de dados relacional MySQL, adequado ao volume e ao tipo de informação tratada.</w:t>
       </w:r>
     </w:p>
     <w:p>
@@ -2054,236 +2105,46 @@
       <w:pPr>
         <w:pStyle w:val="Heading1"/>
       </w:pPr>
-      <w:bookmarkStart w:id="4" w:name="_Toc242745137"/>
+      <w:bookmarkStart w:id="11" w:name="_Toc242749277"/>
       <w:r>
         <w:lastRenderedPageBreak/>
-        <w:t>Revisão Bibliográfica</w:t>
-      </w:r>
-      <w:bookmarkEnd w:id="4"/>
-    </w:p>
-    <w:p>
-      <w:r>
-        <w:t>Esta secção apresenta os conceitos teóricos e as tecnologias que fundamentam o desenvolvimento do DataSyncEngine. Começa por abordar a sincronização de dados e as estratégias de cópia de segurança, para de seguida descrever as tecnologias de programação e de interface utilizadas, terminando com uma reflexão sobre segurança e auditoria de sistemas.</w:t>
-      </w:r>
+        <w:t>III. Desenvolvimento</w:t>
+      </w:r>
+      <w:bookmarkEnd w:id="11"/>
     </w:p>
     <w:p>
       <w:pPr>
         <w:pStyle w:val="Heading2"/>
       </w:pPr>
-      <w:bookmarkStart w:id="5" w:name="_Toc242745138"/>
-      <w:r>
-        <w:t>Sincronização de Dados</w:t>
-      </w:r>
-      <w:bookmarkEnd w:id="5"/>
-    </w:p>
-    <w:p>
-      <w:r>
-        <w:t>A sincronização de dados consiste no processo de garantir que dois ou mais repositórios de informação mantêm um estado coerente ao longo do tempo. Segundo Tanenbaum e Van Steen (2017), os sistemas distribuídos enfrentam o problema da consistência, que exige mecanismos de coordenação para assegurar que as réplicas de um mesmo dado não divergem. As abordagens mais comuns incluem a replicação total e a replicação incremental, sendo esta última mais eficiente por transferir apenas as alterações verificadas desde a última sincronização.</w:t>
-      </w:r>
-    </w:p>
-    <w:p>
-      <w:r>
-        <w:t>A comparação de ficheiros, realizada através de metadados como a data de modificação, o tamanho ou funções de resumo criptográfico, permite identificar rapidamente as diferenças entre origem e destino. Esta técnica, designada por sincronização diferencial, reduz significativamente o tráfego de rede e o tempo de execução, sendo amplamente utilizada em ferramentas como o rsync.</w:t>
+      <w:bookmarkStart w:id="12" w:name="_Toc242749278"/>
+      <w:r>
+        <w:t>1. Arquitetura da solução</w:t>
+      </w:r>
+      <w:bookmarkEnd w:id="12"/>
+    </w:p>
+    <w:p>
+      <w:r>
+        <w:t>A aplicação foi estruturada em três camadas, separando a apresentação da lógica de negócio e do acesso aos dados. Esta separação facilita a manutenção e permite que cada parte evolua de forma independente. A interface gráfica foi dividida em vistas, cada uma responsável por uma área funcional, e todos os componentes partilham o mesmo tema visual para manter a coerência da apresentação.</w:t>
+      </w:r>
+    </w:p>
+    <w:p>
+      <w:r>
+        <w:t>A sincronização é concretizada por um motor dedicado que compara os ficheiros de origem com os do destino e decide quais devem ser copiados, substituídos ou eliminados. Antes de cada operação é produzida uma cópia de segurança do destino, de modo a permitir a reposição imediata em caso de erro. Os ficheiros removidos não são apagados de forma definitiva: passam para a área de reciclagem, de onde podem ser restaurados até serem purgados.</w:t>
       </w:r>
     </w:p>
     <w:p>
       <w:pPr>
         <w:pStyle w:val="Heading2"/>
       </w:pPr>
-      <w:bookmarkStart w:id="6" w:name="_Toc242745139"/>
-      <w:r>
-        <w:t>Estratégias de Cópia de Segurança</w:t>
-      </w:r>
-      <w:bookmarkEnd w:id="6"/>
-    </w:p>
-    <w:p>
-      <w:r>
-        <w:t>A cópia de segurança, ou backup, é uma prática fundamental para garantir a disponibilidade e a integridade dos dados. A regra 3-2-1 recomenda manter três cópias dos dados, em dois suportes distintos, com uma delas fora do local principal. As cópias podem ser completas, incrementais ou diferenciais, cada uma com compromissos diferentes entre o espaço de armazenamento ocupado e o tempo de recuperação. A automatização das cópias, através de agendamentos periódicos, reduz o risco de esquecimento e assegura a continuidade das operações.</w:t>
-      </w:r>
-    </w:p>
-    <w:p>
-      <w:pPr>
-        <w:pStyle w:val="Heading2"/>
-      </w:pPr>
-      <w:bookmarkStart w:id="7" w:name="_Toc242745140"/>
-      <w:r>
-        <w:t>Tecnologias Utilizadas</w:t>
-      </w:r>
-      <w:bookmarkEnd w:id="7"/>
-    </w:p>
-    <w:p>
-      <w:r>
-        <w:t xml:space="preserve">O DataSyncEngine foi desenvolvido na linguagem C#, sobre a plataforma .NET, tirando partido da tipagem estática, da gestão automática de memória e da programação assíncrona para executar operações de entrada e saída sem bloquear a interface. A interface gráfica foi </w:t>
-      </w:r>
-      <w:r>
-        <w:lastRenderedPageBreak/>
-        <w:t>concebida com a framework Windows Forms, complementada com o Standard Toolkit do Krypton, que disponibiliza temas e controlos modernos.</w:t>
-      </w:r>
-    </w:p>
-    <w:p>
-      <w:r>
-        <w:t>A persistência de dados é assegurada pelo sistema de gestão de bases de dados relacionais MySQL, escolhido pela sua maturidade, desempenho e ampla adoção. A comunicação com a base de dados é realizada através de comandos parametrizados, que previnem ataques de injeção de SQL e garantem a segurança das consultas.</w:t>
-      </w:r>
-    </w:p>
-    <w:p>
-      <w:pPr>
-        <w:pStyle w:val="Heading2"/>
-      </w:pPr>
-      <w:bookmarkStart w:id="8" w:name="_Toc242745141"/>
-      <w:r>
-        <w:t>Segurança e Auditoria</w:t>
-      </w:r>
-      <w:bookmarkEnd w:id="8"/>
-    </w:p>
-    <w:p>
-      <w:r>
-        <w:t>A segurança de um sistema de gestão de dados assenta na autenticação, na autorização e no registo de atividades. A autenticação verifica a identidade dos utilizadores, enquanto a autorização determina as operações que cada perfil pode executar. Segundo a OWASP (2021), a proteção de credenciais exige o armazenamento seguro de palavras-passe através de algoritmos de derivação como o bcrypt, e a proteção de dados sensíveis em repouso.</w:t>
-      </w:r>
-    </w:p>
-    <w:p>
-      <w:r>
-        <w:t>A auditoria, por sua vez, consiste no registo sistemático das ações realizadas sobre o sistema, permitindo reconstruir o histórico de operações, detetar comportamentos anómalos e apoiar processos de responsabilização. Um registo de auditoria eficaz deve incluir a data e a hora, o utilizador, a operação efetuada e o resultado da mesma.</w:t>
-      </w:r>
-    </w:p>
-    <w:p>
-      <w:pPr>
-        <w:spacing w:after="160" w:line="259" w:lineRule="auto"/>
-        <w:jc w:val="left"/>
-      </w:pPr>
-      <w:r>
-        <w:br w:type="page"/>
-      </w:r>
-    </w:p>
-    <w:p>
-      <w:pPr>
-        <w:pStyle w:val="Heading1"/>
-      </w:pPr>
-      <w:bookmarkStart w:id="9" w:name="_Toc242745142"/>
-      <w:r>
-        <w:lastRenderedPageBreak/>
-        <w:t>Desenvolvimento</w:t>
-      </w:r>
-      <w:bookmarkEnd w:id="9"/>
-    </w:p>
-    <w:p>
-      <w:r>
-        <w:t>Nesta secção descreve-se o processo de desenvolvimento do DataSyncEngine, desde as decisões de arquitetura e as tecnologias adotadas até à implementação dos diferentes módulos funcionais. Cada módulo é ilustrado com capturas de ecrã da aplicação em funcionamento.</w:t>
-      </w:r>
-    </w:p>
-    <w:p>
-      <w:pPr>
-        <w:pStyle w:val="Heading2"/>
-      </w:pPr>
-      <w:bookmarkStart w:id="10" w:name="_Toc242745143"/>
-      <w:r>
-        <w:t>Arquitetura do Sistema</w:t>
-      </w:r>
-      <w:bookmarkEnd w:id="10"/>
-    </w:p>
-    <w:p>
-      <w:r>
-        <w:t>O sistema segue uma arquitetura em camadas, que separa claramente as responsabilidades e facilita a manutenção e a evolução do código. A camada de apresentação, implementada no projeto Views, contém os formulários e os controlos da interface gráfica. A camada de controlo, no projeto Controller, implementa a lógica de negócio, incluindo a sincronização, a cópia de segurança e a auditoria. A camada de modelo, no projeto Model, define as entidades e os repositórios responsáveis pelo acesso à base de dados através do Entity Framework.</w:t>
-      </w:r>
-    </w:p>
-    <w:p>
-      <w:r>
-        <w:t>Esta separação permite que alterações na interface não afetem a lógica de negócio e que os diferentes componentes sejam testados de forma independente. A injeção de dependências é utilizada para desacoplar as classes e facilitar a substituição de implementações.</w:t>
-      </w:r>
-    </w:p>
-    <w:p>
-      <w:pPr>
-        <w:pStyle w:val="Heading2"/>
-      </w:pPr>
-      <w:bookmarkStart w:id="11" w:name="_Toc242745144"/>
-      <w:r>
-        <w:t>Tecnologias e Ferramentas</w:t>
-      </w:r>
-      <w:bookmarkEnd w:id="11"/>
-    </w:p>
-    <w:p>
-      <w:pPr>
-        <w:ind w:left="560" w:hanging="280"/>
-        <w:jc w:val="left"/>
-      </w:pPr>
-      <w:r>
-        <w:t>•</w:t>
-      </w:r>
-      <w:r>
-        <w:tab/>
-        <w:t>C# e .NET como plataforma de desenvolvimento e execução.</w:t>
-      </w:r>
-    </w:p>
-    <w:p>
-      <w:pPr>
-        <w:ind w:left="560" w:hanging="280"/>
-        <w:jc w:val="left"/>
-      </w:pPr>
-      <w:r>
-        <w:t>•</w:t>
-      </w:r>
-      <w:r>
-        <w:tab/>
-        <w:t>Windows Forms e Krypton Standard Toolkit para a interface gráfica.</w:t>
-      </w:r>
-    </w:p>
-    <w:p>
-      <w:pPr>
-        <w:ind w:left="560" w:hanging="280"/>
-        <w:jc w:val="left"/>
-      </w:pPr>
-      <w:r>
-        <w:t>•</w:t>
-      </w:r>
-      <w:r>
-        <w:tab/>
-        <w:t>MySQL e Entity Framework para a persistência de dados.</w:t>
-      </w:r>
-    </w:p>
-    <w:p>
-      <w:pPr>
-        <w:ind w:left="560" w:hanging="280"/>
-        <w:jc w:val="left"/>
-      </w:pPr>
-      <w:r>
-        <w:t>•</w:t>
-      </w:r>
-      <w:r>
-        <w:tab/>
-        <w:t>Git e GitHub para o controlo de versões e colaboração.</w:t>
-      </w:r>
-    </w:p>
-    <w:p>
-      <w:pPr>
-        <w:ind w:left="560" w:hanging="280"/>
-        <w:jc w:val="left"/>
-      </w:pPr>
-      <w:r>
-        <w:t>•</w:t>
-      </w:r>
-      <w:r>
-        <w:tab/>
-        <w:t>Visual Studio como ambiente integrado de desenvolvimento.</w:t>
-      </w:r>
-    </w:p>
-    <w:p>
-      <w:pPr>
-        <w:pStyle w:val="Heading2"/>
-      </w:pPr>
-      <w:bookmarkStart w:id="12" w:name="_Toc242745145"/>
-      <w:r>
-        <w:t>Interface e Experiência de Utilizador</w:t>
-      </w:r>
-      <w:bookmarkEnd w:id="12"/>
-    </w:p>
-    <w:p>
-      <w:r>
-        <w:t>A interface do DataSyncEngine foi redesenhada segundo os princípios das aplicações web modernas, adotando um esquema de cores inspirado na plataforma GitHub. A navegação principal foi colocada numa barra lateral fixa à esquerda, o que torna o acesso aos módulos mais rápido e intuitivo, em vez de depender de separadores no topo do conteúdo. O cabeçalho apresenta o título e a descrição da secção ativa, proporcionando ao utilizador um contexto imediato.</w:t>
-      </w:r>
-    </w:p>
-    <w:p>
-      <w:r>
-        <w:lastRenderedPageBreak/>
-        <w:t>O sistema disponibiliza dois temas, claro e escuro, bem como a possibilidade de ajustar o tamanho e o estilo da tipografia, contribuindo para a acessibilidade e o conforto visual. A figura seguinte apresenta a página de autenticação, ponto de entrada da aplicação.</w:t>
+      <w:bookmarkStart w:id="13" w:name="_Toc242749279"/>
+      <w:r>
+        <w:t>2. Autenticação e arranque</w:t>
+      </w:r>
+      <w:bookmarkEnd w:id="13"/>
+    </w:p>
+    <w:p>
+      <w:r>
+        <w:t>Ao iniciar, a aplicação apresenta um ecrã de arranque que antecede a janela de autenticação. Nesta janela o utilizador introduz o seu nome e a sua palavra-passe; o sistema valida as credenciais e, mediante o perfil do utilizador, liberta ou restringe as funcionalidades disponíveis.</w:t>
       </w:r>
     </w:p>
     <w:p>
@@ -2295,12 +2156,15 @@
         <w:rPr>
           <w:noProof/>
         </w:rPr>
+        <w:lastRenderedPageBreak/>
         <w:drawing>
-          <wp:inline distT="0" distB="0" distL="0" distR="0" wp14:anchorId="782941D4" wp14:editId="6D6A9F55">
-            <wp:extent cx="3810196" cy="3454578"/>
-            <wp:effectExtent l="0" t="0" r="0" b="0"/>
+          <wp:inline distT="0" distB="0" distL="0" distR="0" wp14:anchorId="2A6DAB6B" wp14:editId="468FDDCC">
+            <wp:extent cx="5177235" cy="3679598"/>
+            <wp:effectExtent l="0" t="0" r="4445" b="0"/>
             <wp:docPr id="1" name="Picture 1"/>
-            <wp:cNvGraphicFramePr/>
+            <wp:cNvGraphicFramePr>
+              <a:graphicFrameLocks xmlns:a="http://schemas.openxmlformats.org/drawingml/2006/main" noChangeAspect="1"/>
+            </wp:cNvGraphicFramePr>
             <a:graphic xmlns:a="http://schemas.openxmlformats.org/drawingml/2006/main">
               <a:graphicData uri="http://schemas.openxmlformats.org/drawingml/2006/picture">
                 <pic:pic xmlns:pic="http://schemas.openxmlformats.org/drawingml/2006/picture">
@@ -2323,7 +2187,7 @@
                   <pic:spPr>
                     <a:xfrm>
                       <a:off x="0" y="0"/>
-                      <a:ext cx="3810196" cy="3454578"/>
+                      <a:ext cx="5177235" cy="3679598"/>
                     </a:xfrm>
                     <a:prstGeom prst="rect">
                       <a:avLst/>
@@ -2341,12 +2205,7 @@
         <w:pStyle w:val="Caption"/>
       </w:pPr>
       <w:r>
-        <w:t>Figura 1: Ecrã de autenticação do DataSyncEngine.</w:t>
-      </w:r>
-    </w:p>
-    <w:p>
-      <w:r>
-        <w:t>O painel principal reúne indicadores-chave sobre o estado da sincronização, o número de ficheiros, os servidores configurados e as operações pendentes, oferecendo uma visão global imediata do sistema.</w:t>
+        <w:t>Figura 1: Ecrã de arranque da aplicação.</w:t>
       </w:r>
     </w:p>
     <w:p>
@@ -2359,9 +2218,9 @@
           <w:noProof/>
         </w:rPr>
         <w:drawing>
-          <wp:inline distT="0" distB="0" distL="0" distR="0" wp14:anchorId="4A2A3F31" wp14:editId="5DDA4F9D">
-            <wp:extent cx="5176516" cy="2738628"/>
-            <wp:effectExtent l="0" t="0" r="5715" b="5080"/>
+          <wp:inline distT="0" distB="0" distL="0" distR="0" wp14:anchorId="6A9E1741" wp14:editId="08B8880B">
+            <wp:extent cx="5218067" cy="4731047"/>
+            <wp:effectExtent l="0" t="0" r="1905" b="0"/>
             <wp:docPr id="2" name="Picture 2"/>
             <wp:cNvGraphicFramePr>
               <a:graphicFrameLocks xmlns:a="http://schemas.openxmlformats.org/drawingml/2006/main" noChangeAspect="1"/>
@@ -2374,7 +2233,83 @@
                     <pic:cNvPicPr/>
                   </pic:nvPicPr>
                   <pic:blipFill>
-                    <a:blip r:embed="rId13" cstate="print">
+                    <a:blip r:embed="rId13">
+                      <a:extLst>
+                        <a:ext uri="{28A0092B-C50C-407E-A947-70E740481C1C}">
+                          <a14:useLocalDpi xmlns:a14="http://schemas.microsoft.com/office/drawing/2010/main" val="0"/>
+                        </a:ext>
+                      </a:extLst>
+                    </a:blip>
+                    <a:stretch>
+                      <a:fillRect/>
+                    </a:stretch>
+                  </pic:blipFill>
+                  <pic:spPr>
+                    <a:xfrm>
+                      <a:off x="0" y="0"/>
+                      <a:ext cx="5218067" cy="4731047"/>
+                    </a:xfrm>
+                    <a:prstGeom prst="rect">
+                      <a:avLst/>
+                    </a:prstGeom>
+                  </pic:spPr>
+                </pic:pic>
+              </a:graphicData>
+            </a:graphic>
+          </wp:inline>
+        </w:drawing>
+      </w:r>
+    </w:p>
+    <w:p>
+      <w:pPr>
+        <w:pStyle w:val="Caption"/>
+      </w:pPr>
+      <w:r>
+        <w:lastRenderedPageBreak/>
+        <w:t>Figura 2: Janela de autenticação.</w:t>
+      </w:r>
+    </w:p>
+    <w:p>
+      <w:pPr>
+        <w:pStyle w:val="Heading2"/>
+      </w:pPr>
+      <w:bookmarkStart w:id="14" w:name="_Toc242749280"/>
+      <w:r>
+        <w:t>3. Interface principal</w:t>
+      </w:r>
+      <w:bookmarkEnd w:id="14"/>
+    </w:p>
+    <w:p>
+      <w:r>
+        <w:t>Depois de autenticado, o utilizador entra na janela principal, na qual as funcionalidades estão organizadas em separadores. A barra lateral permite navegar entre as partes do sistema, e o conteúdo é apresentado nas respetivas áreas de trabalho, mantendo sempre a mesma linha visual.</w:t>
+      </w:r>
+    </w:p>
+    <w:p>
+      <w:pPr>
+        <w:spacing w:after="80" w:line="240" w:lineRule="auto"/>
+        <w:jc w:val="center"/>
+      </w:pPr>
+      <w:r>
+        <w:rPr>
+          <w:noProof/>
+        </w:rPr>
+        <w:drawing>
+          <wp:inline distT="0" distB="0" distL="0" distR="0" wp14:anchorId="54ACCA47" wp14:editId="422140A0">
+            <wp:extent cx="5176516" cy="2738628"/>
+            <wp:effectExtent l="0" t="0" r="5715" b="5080"/>
+            <wp:docPr id="3" name="Picture 3"/>
+            <wp:cNvGraphicFramePr>
+              <a:graphicFrameLocks xmlns:a="http://schemas.openxmlformats.org/drawingml/2006/main" noChangeAspect="1"/>
+            </wp:cNvGraphicFramePr>
+            <a:graphic xmlns:a="http://schemas.openxmlformats.org/drawingml/2006/main">
+              <a:graphicData uri="http://schemas.openxmlformats.org/drawingml/2006/picture">
+                <pic:pic xmlns:pic="http://schemas.openxmlformats.org/drawingml/2006/picture">
+                  <pic:nvPicPr>
+                    <pic:cNvPr id="3" name=""/>
+                    <pic:cNvPicPr/>
+                  </pic:nvPicPr>
+                  <pic:blipFill>
+                    <a:blip r:embed="rId14" cstate="print">
                       <a:extLst>
                         <a:ext uri="{28A0092B-C50C-407E-A947-70E740481C1C}">
                           <a14:useLocalDpi xmlns:a14="http://schemas.microsoft.com/office/drawing/2010/main" val="0"/>
@@ -2406,33 +2341,22 @@
         <w:pStyle w:val="Caption"/>
       </w:pPr>
       <w:r>
-        <w:t>Figura 2: Painel principal com indicadores de estado.</w:t>
+        <w:t>Figura 3: Painel principal da aplicação, com a barra de navegação lateral.</w:t>
       </w:r>
     </w:p>
     <w:p>
       <w:pPr>
         <w:pStyle w:val="Heading2"/>
       </w:pPr>
-      <w:bookmarkStart w:id="13" w:name="_Toc242745146"/>
-      <w:r>
-        <w:lastRenderedPageBreak/>
-        <w:t>Módulos Funcionais</w:t>
-      </w:r>
-      <w:bookmarkEnd w:id="13"/>
-    </w:p>
-    <w:p>
-      <w:pPr>
-        <w:pStyle w:val="Heading3"/>
-      </w:pPr>
-      <w:bookmarkStart w:id="14" w:name="_Toc242745147"/>
-      <w:r>
-        <w:t>Arranque e Autenticação</w:t>
-      </w:r>
-      <w:bookmarkEnd w:id="14"/>
-    </w:p>
-    <w:p>
-      <w:r>
-        <w:t>A aplicação inicia-se com um ecrã de arranque que apresenta a identidade visual do sistema enquanto os serviços são inicializados. Seguidamente é solicitada a autenticação do utilizador, sendo as credenciais validadas de forma segura contra a base de dados.</w:t>
+      <w:bookmarkStart w:id="15" w:name="_Toc242749281"/>
+      <w:r>
+        <w:t>4. Sincronização</w:t>
+      </w:r>
+      <w:bookmarkEnd w:id="15"/>
+    </w:p>
+    <w:p>
+      <w:r>
+        <w:t>O separador de sincronização permite criar e gerir tarefas de sincronização. Para cada tarefa podem ser indicados o servidor de origem, o destino, o intervalo de execução e o tipo de operação a realizar. A lista apresentada reflete o estado de cada tarefa, incluindo a sua periodicidade e o instante da última execução.</w:t>
       </w:r>
     </w:p>
     <w:p>
@@ -2444,21 +2368,24 @@
         <w:rPr>
           <w:noProof/>
         </w:rPr>
+        <w:lastRenderedPageBreak/>
         <w:drawing>
-          <wp:inline distT="0" distB="0" distL="0" distR="0" wp14:anchorId="304A4689" wp14:editId="1B29A581">
-            <wp:extent cx="4127712" cy="2933851"/>
-            <wp:effectExtent l="0" t="0" r="6350" b="0"/>
-            <wp:docPr id="3" name="Picture 3"/>
-            <wp:cNvGraphicFramePr/>
+          <wp:inline distT="0" distB="0" distL="0" distR="0" wp14:anchorId="62FB209B" wp14:editId="57C9581C">
+            <wp:extent cx="5176516" cy="2738628"/>
+            <wp:effectExtent l="0" t="0" r="5715" b="5080"/>
+            <wp:docPr id="4" name="Picture 4"/>
+            <wp:cNvGraphicFramePr>
+              <a:graphicFrameLocks xmlns:a="http://schemas.openxmlformats.org/drawingml/2006/main" noChangeAspect="1"/>
+            </wp:cNvGraphicFramePr>
             <a:graphic xmlns:a="http://schemas.openxmlformats.org/drawingml/2006/main">
               <a:graphicData uri="http://schemas.openxmlformats.org/drawingml/2006/picture">
                 <pic:pic xmlns:pic="http://schemas.openxmlformats.org/drawingml/2006/picture">
                   <pic:nvPicPr>
-                    <pic:cNvPr id="3" name=""/>
+                    <pic:cNvPr id="4" name=""/>
                     <pic:cNvPicPr/>
                   </pic:nvPicPr>
                   <pic:blipFill>
-                    <a:blip r:embed="rId14">
+                    <a:blip r:embed="rId15" cstate="print">
                       <a:extLst>
                         <a:ext uri="{28A0092B-C50C-407E-A947-70E740481C1C}">
                           <a14:useLocalDpi xmlns:a14="http://schemas.microsoft.com/office/drawing/2010/main" val="0"/>
@@ -2472,7 +2399,7 @@
                   <pic:spPr>
                     <a:xfrm>
                       <a:off x="0" y="0"/>
-                      <a:ext cx="4127712" cy="2933851"/>
+                      <a:ext cx="5176516" cy="2738628"/>
                     </a:xfrm>
                     <a:prstGeom prst="rect">
                       <a:avLst/>
@@ -2490,12 +2417,22 @@
         <w:pStyle w:val="Caption"/>
       </w:pPr>
       <w:r>
-        <w:t>Figura 3: Ecrã de arranque da aplicação.</w:t>
-      </w:r>
-    </w:p>
-    <w:p>
-      <w:r>
-        <w:t>Por motivos de segurança, após um número configurável de tentativas falhadas consecutivas, a conta é temporariamente bloqueada. Durante o bloqueio é apresentada uma vista específica que impede novas tentativas até ao fim do período de espera.</w:t>
+        <w:t>Figura 4: Gestão de tarefas de sincronização.</w:t>
+      </w:r>
+    </w:p>
+    <w:p>
+      <w:pPr>
+        <w:pStyle w:val="Heading2"/>
+      </w:pPr>
+      <w:bookmarkStart w:id="16" w:name="_Toc242749282"/>
+      <w:r>
+        <w:t>5. Cópias de segurança</w:t>
+      </w:r>
+      <w:bookmarkEnd w:id="16"/>
+    </w:p>
+    <w:p>
+      <w:r>
+        <w:t>Antes de qualquer sincronização é possível gerar uma cópia de segurança. O separador correspondente lista as cópias existentes e permite restaurar um estado anterior dos dados, o que se revela essencial quando uma operação corre de forma imprevista.</w:t>
       </w:r>
     </w:p>
     <w:p>
@@ -2508,81 +2445,7 @@
           <w:noProof/>
         </w:rPr>
         <w:drawing>
-          <wp:inline distT="0" distB="0" distL="0" distR="0" wp14:anchorId="6D104910" wp14:editId="57CE0652">
-            <wp:extent cx="3206915" cy="1943200"/>
-            <wp:effectExtent l="0" t="0" r="0" b="0"/>
-            <wp:docPr id="4" name="Picture 4"/>
-            <wp:cNvGraphicFramePr/>
-            <a:graphic xmlns:a="http://schemas.openxmlformats.org/drawingml/2006/main">
-              <a:graphicData uri="http://schemas.openxmlformats.org/drawingml/2006/picture">
-                <pic:pic xmlns:pic="http://schemas.openxmlformats.org/drawingml/2006/picture">
-                  <pic:nvPicPr>
-                    <pic:cNvPr id="4" name=""/>
-                    <pic:cNvPicPr/>
-                  </pic:nvPicPr>
-                  <pic:blipFill>
-                    <a:blip r:embed="rId15">
-                      <a:extLst>
-                        <a:ext uri="{28A0092B-C50C-407E-A947-70E740481C1C}">
-                          <a14:useLocalDpi xmlns:a14="http://schemas.microsoft.com/office/drawing/2010/main" val="0"/>
-                        </a:ext>
-                      </a:extLst>
-                    </a:blip>
-                    <a:stretch>
-                      <a:fillRect/>
-                    </a:stretch>
-                  </pic:blipFill>
-                  <pic:spPr>
-                    <a:xfrm>
-                      <a:off x="0" y="0"/>
-                      <a:ext cx="3206915" cy="1943200"/>
-                    </a:xfrm>
-                    <a:prstGeom prst="rect">
-                      <a:avLst/>
-                    </a:prstGeom>
-                  </pic:spPr>
-                </pic:pic>
-              </a:graphicData>
-            </a:graphic>
-          </wp:inline>
-        </w:drawing>
-      </w:r>
-    </w:p>
-    <w:p>
-      <w:pPr>
-        <w:pStyle w:val="Caption"/>
-      </w:pPr>
-      <w:r>
-        <w:t>Figura 4: Bloqueio automático após tentativas de início de sessão falhadas.</w:t>
-      </w:r>
-    </w:p>
-    <w:p>
-      <w:pPr>
-        <w:pStyle w:val="Heading3"/>
-      </w:pPr>
-      <w:bookmarkStart w:id="15" w:name="_Toc242745148"/>
-      <w:r>
-        <w:lastRenderedPageBreak/>
-        <w:t>Sincronização de Dados</w:t>
-      </w:r>
-      <w:bookmarkEnd w:id="15"/>
-    </w:p>
-    <w:p>
-      <w:r>
-        <w:t>O módulo de sincronização compara os ficheiros do servidor local com os dos servidores remotos e transfere apenas os elementos novos ou alterados. A operação é realizada de forma assíncrona, apresentando uma barra de progresso e uma estimativa do tempo restante, sem bloquear a interface.</w:t>
-      </w:r>
-    </w:p>
-    <w:p>
-      <w:pPr>
-        <w:spacing w:after="80" w:line="240" w:lineRule="auto"/>
-        <w:jc w:val="center"/>
-      </w:pPr>
-      <w:r>
-        <w:rPr>
-          <w:noProof/>
-        </w:rPr>
-        <w:drawing>
-          <wp:inline distT="0" distB="0" distL="0" distR="0" wp14:anchorId="1B7F083E" wp14:editId="2229CF25">
+          <wp:inline distT="0" distB="0" distL="0" distR="0" wp14:anchorId="722F7188" wp14:editId="06E0045C">
             <wp:extent cx="5176516" cy="2738628"/>
             <wp:effectExtent l="0" t="0" r="5715" b="5080"/>
             <wp:docPr id="5" name="Picture 5"/>
@@ -2629,22 +2492,22 @@
         <w:pStyle w:val="Caption"/>
       </w:pPr>
       <w:r>
-        <w:t>Figura 5: Módulo de sincronização de ficheiros.</w:t>
-      </w:r>
-    </w:p>
-    <w:p>
-      <w:pPr>
-        <w:pStyle w:val="Heading3"/>
-      </w:pPr>
-      <w:bookmarkStart w:id="16" w:name="_Toc242745149"/>
-      <w:r>
-        <w:t>Cópia de Segurança</w:t>
-      </w:r>
-      <w:bookmarkEnd w:id="16"/>
-    </w:p>
-    <w:p>
-      <w:r>
-        <w:t>O módulo de cópia de segurança permite criar pontos de restauro de forma manual ou automática, registando a data e a hora da última execução. As cópias podem ser exportadas para formatos interoperáveis, facilitando o arquivo e a partilha.</w:t>
+        <w:t>Figura 5: Lista de cópias de segurança disponíveis.</w:t>
+      </w:r>
+    </w:p>
+    <w:p>
+      <w:pPr>
+        <w:pStyle w:val="Heading2"/>
+      </w:pPr>
+      <w:bookmarkStart w:id="17" w:name="_Toc242749283"/>
+      <w:r>
+        <w:t>6. Reciclagem</w:t>
+      </w:r>
+      <w:bookmarkEnd w:id="17"/>
+    </w:p>
+    <w:p>
+      <w:r>
+        <w:t>Os ficheiros eliminados nas sincronizações são movidos para a reciclagem, em vez de serem removidos por completo. A partir deste separador podem ser restaurados para a localização original ou removidos em definitivo.</w:t>
       </w:r>
     </w:p>
     <w:p>
@@ -2656,8 +2519,9 @@
         <w:rPr>
           <w:noProof/>
         </w:rPr>
+        <w:lastRenderedPageBreak/>
         <w:drawing>
-          <wp:inline distT="0" distB="0" distL="0" distR="0" wp14:anchorId="014E212C" wp14:editId="7534841A">
+          <wp:inline distT="0" distB="0" distL="0" distR="0" wp14:anchorId="2AC4051C" wp14:editId="5203EF54">
             <wp:extent cx="5176516" cy="2738628"/>
             <wp:effectExtent l="0" t="0" r="5715" b="5080"/>
             <wp:docPr id="6" name="Picture 6"/>
@@ -2704,23 +2568,22 @@
         <w:pStyle w:val="Caption"/>
       </w:pPr>
       <w:r>
-        <w:t>Figura 6: Módulo de cópia de segurança.</w:t>
-      </w:r>
-    </w:p>
-    <w:p>
-      <w:pPr>
-        <w:pStyle w:val="Heading3"/>
-      </w:pPr>
-      <w:bookmarkStart w:id="17" w:name="_Toc242745150"/>
-      <w:r>
-        <w:lastRenderedPageBreak/>
-        <w:t>Reciclagem</w:t>
-      </w:r>
-      <w:bookmarkEnd w:id="17"/>
-    </w:p>
-    <w:p>
-      <w:r>
-        <w:t>Os elementos eliminados são movidos para uma área de reciclagem, de onde podem ser restaurados ou eliminados definitivamente. Esta abordagem protege contra eliminações acidentais e permite reverter operações indesejadas.</w:t>
+        <w:t>Figura 6: Área de reciclagem de ficheiros.</w:t>
+      </w:r>
+    </w:p>
+    <w:p>
+      <w:pPr>
+        <w:pStyle w:val="Heading2"/>
+      </w:pPr>
+      <w:bookmarkStart w:id="18" w:name="_Toc242749284"/>
+      <w:r>
+        <w:t>7. Servidores</w:t>
+      </w:r>
+      <w:bookmarkEnd w:id="18"/>
+    </w:p>
+    <w:p>
+      <w:r>
+        <w:t>A gestão dos servidores concentra-se num separador próprio, onde se registam os parâmetros de cada máquina, tais como o endereço, o tipo de ligação e a sua identificação. Este registo serve de base à criação das tarefas de sincronização.</w:t>
       </w:r>
     </w:p>
     <w:p>
@@ -2733,7 +2596,7 @@
           <w:noProof/>
         </w:rPr>
         <w:drawing>
-          <wp:inline distT="0" distB="0" distL="0" distR="0" wp14:anchorId="093667E4" wp14:editId="7EE4B409">
+          <wp:inline distT="0" distB="0" distL="0" distR="0" wp14:anchorId="1DE67C43" wp14:editId="4A02BEF5">
             <wp:extent cx="5176516" cy="2738628"/>
             <wp:effectExtent l="0" t="0" r="5715" b="5080"/>
             <wp:docPr id="7" name="Picture 7"/>
@@ -2780,22 +2643,22 @@
         <w:pStyle w:val="Caption"/>
       </w:pPr>
       <w:r>
-        <w:t>Figura 7: Área de reciclagem de ficheiros.</w:t>
-      </w:r>
-    </w:p>
-    <w:p>
-      <w:pPr>
-        <w:pStyle w:val="Heading3"/>
-      </w:pPr>
-      <w:bookmarkStart w:id="18" w:name="_Toc242745151"/>
-      <w:r>
-        <w:t>Gestão de Servidores</w:t>
-      </w:r>
-      <w:bookmarkEnd w:id="18"/>
-    </w:p>
-    <w:p>
-      <w:r>
-        <w:t>A gestão de servidores permite registar, editar e ativar as ligações a servidores remotos, armazenando as credenciais de forma cifrada. A chave-mestra protege as informações sensíveis utilizadas nas ligações.</w:t>
+        <w:t>Figura 7: Registo e configuração de servidores.</w:t>
+      </w:r>
+    </w:p>
+    <w:p>
+      <w:pPr>
+        <w:pStyle w:val="Heading2"/>
+      </w:pPr>
+      <w:bookmarkStart w:id="19" w:name="_Toc242749285"/>
+      <w:r>
+        <w:t>8. Auditoria</w:t>
+      </w:r>
+      <w:bookmarkEnd w:id="19"/>
+    </w:p>
+    <w:p>
+      <w:r>
+        <w:t>Todas as operações executadas na aplicação ficam registadas num diário de auditoria. O separador correspondente permite consultar a sequência de eventos por utilizador e por data, o que facilita a detecção de comportamentos anómalos e a verificação do histórico.</w:t>
       </w:r>
     </w:p>
     <w:p>
@@ -2807,8 +2670,9 @@
         <w:rPr>
           <w:noProof/>
         </w:rPr>
+        <w:lastRenderedPageBreak/>
         <w:drawing>
-          <wp:inline distT="0" distB="0" distL="0" distR="0" wp14:anchorId="390B49EA" wp14:editId="5A4D8ECB">
+          <wp:inline distT="0" distB="0" distL="0" distR="0" wp14:anchorId="7FDD5422" wp14:editId="2ECDCF5E">
             <wp:extent cx="5176516" cy="2738628"/>
             <wp:effectExtent l="0" t="0" r="5715" b="5080"/>
             <wp:docPr id="8" name="Picture 8"/>
@@ -2855,7 +2719,22 @@
         <w:pStyle w:val="Caption"/>
       </w:pPr>
       <w:r>
-        <w:t>Figura 8: Lista de servidores configurados.</w:t>
+        <w:t>Figura 8: Registo de auditoria das operações.</w:t>
+      </w:r>
+    </w:p>
+    <w:p>
+      <w:pPr>
+        <w:pStyle w:val="Heading2"/>
+      </w:pPr>
+      <w:bookmarkStart w:id="20" w:name="_Toc242749286"/>
+      <w:r>
+        <w:t>9. Estatísticas</w:t>
+      </w:r>
+      <w:bookmarkEnd w:id="20"/>
+    </w:p>
+    <w:p>
+      <w:r>
+        <w:t>Para apoiar a monitorização do sistema, foi incluída uma vista de estatísticas que resume a atividade da aplicação. A informação é apresentada sob a forma de contadores e de gráficos, dando uma leitura rápida do estado do sistema ao longo do tempo.</w:t>
       </w:r>
     </w:p>
     <w:p>
@@ -2867,13 +2746,14 @@
         <w:rPr>
           <w:noProof/>
         </w:rPr>
-        <w:lastRenderedPageBreak/>
         <w:drawing>
-          <wp:inline distT="0" distB="0" distL="0" distR="0" wp14:anchorId="66BC0BBF" wp14:editId="0689833C">
-            <wp:extent cx="3175163" cy="4324572"/>
-            <wp:effectExtent l="0" t="0" r="6350" b="0"/>
+          <wp:inline distT="0" distB="0" distL="0" distR="0" wp14:anchorId="05C51CCE" wp14:editId="1C8A023E">
+            <wp:extent cx="5176516" cy="2738628"/>
+            <wp:effectExtent l="0" t="0" r="5715" b="5080"/>
             <wp:docPr id="9" name="Picture 9"/>
-            <wp:cNvGraphicFramePr/>
+            <wp:cNvGraphicFramePr>
+              <a:graphicFrameLocks xmlns:a="http://schemas.openxmlformats.org/drawingml/2006/main" noChangeAspect="1"/>
+            </wp:cNvGraphicFramePr>
             <a:graphic xmlns:a="http://schemas.openxmlformats.org/drawingml/2006/main">
               <a:graphicData uri="http://schemas.openxmlformats.org/drawingml/2006/picture">
                 <pic:pic xmlns:pic="http://schemas.openxmlformats.org/drawingml/2006/picture">
@@ -2882,7 +2762,7 @@
                     <pic:cNvPicPr/>
                   </pic:nvPicPr>
                   <pic:blipFill>
-                    <a:blip r:embed="rId20">
+                    <a:blip r:embed="rId20" cstate="print">
                       <a:extLst>
                         <a:ext uri="{28A0092B-C50C-407E-A947-70E740481C1C}">
                           <a14:useLocalDpi xmlns:a14="http://schemas.microsoft.com/office/drawing/2010/main" val="0"/>
@@ -2896,7 +2776,7 @@
                   <pic:spPr>
                     <a:xfrm>
                       <a:off x="0" y="0"/>
-                      <a:ext cx="3175163" cy="4324572"/>
+                      <a:ext cx="5176516" cy="2738628"/>
                     </a:xfrm>
                     <a:prstGeom prst="rect">
                       <a:avLst/>
@@ -2914,7 +2794,22 @@
         <w:pStyle w:val="Caption"/>
       </w:pPr>
       <w:r>
-        <w:t>Figura 9: Configuração de um servidor.</w:t>
+        <w:t>Figura 9: Vista de estatísticas e gráficos.</w:t>
+      </w:r>
+    </w:p>
+    <w:p>
+      <w:pPr>
+        <w:pStyle w:val="Heading2"/>
+      </w:pPr>
+      <w:bookmarkStart w:id="21" w:name="_Toc242749287"/>
+      <w:r>
+        <w:t>10. Utilizadores</w:t>
+      </w:r>
+      <w:bookmarkEnd w:id="21"/>
+    </w:p>
+    <w:p>
+      <w:r>
+        <w:t>A gestão de utilizadores permite criar contas, definir perfis de acesso e alterar permissões. Cada utilizador pode, posteriormente, personalizar a sua própria configuração sem interferir com as definições dos restantes.</w:t>
       </w:r>
     </w:p>
     <w:p>
@@ -2926,12 +2821,15 @@
         <w:rPr>
           <w:noProof/>
         </w:rPr>
+        <w:lastRenderedPageBreak/>
         <w:drawing>
-          <wp:inline distT="0" distB="0" distL="0" distR="0" wp14:anchorId="677D2838" wp14:editId="1A52B929">
-            <wp:extent cx="3016405" cy="2063856"/>
-            <wp:effectExtent l="0" t="0" r="0" b="0"/>
+          <wp:inline distT="0" distB="0" distL="0" distR="0" wp14:anchorId="25418F82" wp14:editId="6BF657A5">
+            <wp:extent cx="5176516" cy="2738628"/>
+            <wp:effectExtent l="0" t="0" r="5715" b="5080"/>
             <wp:docPr id="10" name="Picture 10"/>
-            <wp:cNvGraphicFramePr/>
+            <wp:cNvGraphicFramePr>
+              <a:graphicFrameLocks xmlns:a="http://schemas.openxmlformats.org/drawingml/2006/main" noChangeAspect="1"/>
+            </wp:cNvGraphicFramePr>
             <a:graphic xmlns:a="http://schemas.openxmlformats.org/drawingml/2006/main">
               <a:graphicData uri="http://schemas.openxmlformats.org/drawingml/2006/picture">
                 <pic:pic xmlns:pic="http://schemas.openxmlformats.org/drawingml/2006/picture">
@@ -2940,7 +2838,7 @@
                     <pic:cNvPicPr/>
                   </pic:nvPicPr>
                   <pic:blipFill>
-                    <a:blip r:embed="rId21">
+                    <a:blip r:embed="rId21" cstate="print">
                       <a:extLst>
                         <a:ext uri="{28A0092B-C50C-407E-A947-70E740481C1C}">
                           <a14:useLocalDpi xmlns:a14="http://schemas.microsoft.com/office/drawing/2010/main" val="0"/>
@@ -2954,7 +2852,7 @@
                   <pic:spPr>
                     <a:xfrm>
                       <a:off x="0" y="0"/>
-                      <a:ext cx="3016405" cy="2063856"/>
+                      <a:ext cx="5176516" cy="2738628"/>
                     </a:xfrm>
                     <a:prstGeom prst="rect">
                       <a:avLst/>
@@ -2972,22 +2870,22 @@
         <w:pStyle w:val="Caption"/>
       </w:pPr>
       <w:r>
-        <w:t>Figura 10: Introdução da chave-mestra.</w:t>
-      </w:r>
-    </w:p>
-    <w:p>
-      <w:pPr>
-        <w:pStyle w:val="Heading3"/>
-      </w:pPr>
-      <w:bookmarkStart w:id="19" w:name="_Toc242745152"/>
-      <w:r>
-        <w:t>Auditoria</w:t>
-      </w:r>
-      <w:bookmarkEnd w:id="19"/>
-    </w:p>
-    <w:p>
-      <w:r>
-        <w:t>O módulo de auditoria regista cronologicamente todas as operações relevantes, incluindo o utilizador responsável, a ação realizada e o respetivo resultado. Os registos podem ser filtrados e exportados para formato CSV, apoiando a análise e a responsabilização.</w:t>
+        <w:t>Figura 10: Gestão de utilizadores e respetivos perfis.</w:t>
+      </w:r>
+    </w:p>
+    <w:p>
+      <w:pPr>
+        <w:pStyle w:val="Heading2"/>
+      </w:pPr>
+      <w:bookmarkStart w:id="22" w:name="_Toc242749288"/>
+      <w:r>
+        <w:t>11. Definições</w:t>
+      </w:r>
+      <w:bookmarkEnd w:id="22"/>
+    </w:p>
+    <w:p>
+      <w:r>
+        <w:t>No separador de definições agrupam-se as opções gerais da aplicação, incluindo aspetos relacionados com o comportamento e a aparência da interface. As alterações introduzidas são aplicadas de forma imediata.</w:t>
       </w:r>
     </w:p>
     <w:p>
@@ -2999,9 +2897,8 @@
         <w:rPr>
           <w:noProof/>
         </w:rPr>
-        <w:lastRenderedPageBreak/>
         <w:drawing>
-          <wp:inline distT="0" distB="0" distL="0" distR="0" wp14:anchorId="593165DA" wp14:editId="451F3D9B">
+          <wp:inline distT="0" distB="0" distL="0" distR="0" wp14:anchorId="1555C5D7" wp14:editId="4A400F68">
             <wp:extent cx="5176516" cy="2738628"/>
             <wp:effectExtent l="0" t="0" r="5715" b="5080"/>
             <wp:docPr id="11" name="Picture 11"/>
@@ -3048,22 +2945,26 @@
         <w:pStyle w:val="Caption"/>
       </w:pPr>
       <w:r>
-        <w:t>Figura 11: Registo de auditoria com filtros.</w:t>
-      </w:r>
-    </w:p>
-    <w:p>
-      <w:pPr>
-        <w:pStyle w:val="Heading3"/>
-      </w:pPr>
-      <w:bookmarkStart w:id="20" w:name="_Toc242745153"/>
-      <w:r>
-        <w:t>Estatísticas</w:t>
-      </w:r>
-      <w:bookmarkEnd w:id="20"/>
-    </w:p>
-    <w:p>
-      <w:r>
-        <w:t>O módulo de estatísticas apresenta métricas agregadas sobre a utilização do sistema, como o total de ficheiros, o volume de dados sincronizados e a distribuição por servidor, auxiliando a tomada de decisão.</w:t>
+        <w:t>Figura 11: Definições gerais da aplicação.</w:t>
+      </w:r>
+    </w:p>
+    <w:p>
+      <w:pPr>
+        <w:pStyle w:val="Heading2"/>
+      </w:pPr>
+      <w:bookmarkStart w:id="23" w:name="_Toc242749289"/>
+      <w:r>
+        <w:t>12. Diálogos e configurações adicionais</w:t>
+      </w:r>
+      <w:bookmarkEnd w:id="23"/>
+    </w:p>
+    <w:p>
+      <w:r>
+        <w:t xml:space="preserve">Para além das vistas principais, a aplicação disponibiliza vários diálogos que apoiam o trabalho diário. O bloqueio do ecrã protege a sessão quando o utilizador se ausenta; a alteração da </w:t>
+      </w:r>
+      <w:r>
+        <w:lastRenderedPageBreak/>
+        <w:t>palavra-passe reforça a segurança das contas; e os diálogos de configuração permitem definir o perfil do próprio utilizador e os parâmetros de ligação aos servidores.</w:t>
       </w:r>
     </w:p>
     <w:p>
@@ -3076,9 +2977,9 @@
           <w:noProof/>
         </w:rPr>
         <w:drawing>
-          <wp:inline distT="0" distB="0" distL="0" distR="0" wp14:anchorId="53D2D558" wp14:editId="59C28A3B">
-            <wp:extent cx="5176516" cy="2738628"/>
-            <wp:effectExtent l="0" t="0" r="5715" b="5080"/>
+          <wp:inline distT="0" distB="0" distL="0" distR="0" wp14:anchorId="71D6D75B" wp14:editId="5B272963">
+            <wp:extent cx="5176822" cy="3136568"/>
+            <wp:effectExtent l="0" t="0" r="5080" b="6985"/>
             <wp:docPr id="12" name="Picture 12"/>
             <wp:cNvGraphicFramePr>
               <a:graphicFrameLocks xmlns:a="http://schemas.openxmlformats.org/drawingml/2006/main" noChangeAspect="1"/>
@@ -3091,7 +2992,7 @@
                     <pic:cNvPicPr/>
                   </pic:nvPicPr>
                   <pic:blipFill>
-                    <a:blip r:embed="rId23" cstate="print">
+                    <a:blip r:embed="rId23">
                       <a:extLst>
                         <a:ext uri="{28A0092B-C50C-407E-A947-70E740481C1C}">
                           <a14:useLocalDpi xmlns:a14="http://schemas.microsoft.com/office/drawing/2010/main" val="0"/>
@@ -3105,7 +3006,7 @@
                   <pic:spPr>
                     <a:xfrm>
                       <a:off x="0" y="0"/>
-                      <a:ext cx="5176516" cy="2738628"/>
+                      <a:ext cx="5176822" cy="3136568"/>
                     </a:xfrm>
                     <a:prstGeom prst="rect">
                       <a:avLst/>
@@ -3123,22 +3024,7 @@
         <w:pStyle w:val="Caption"/>
       </w:pPr>
       <w:r>
-        <w:t>Figura 12: Vista de estatísticas do sistema.</w:t>
-      </w:r>
-    </w:p>
-    <w:p>
-      <w:pPr>
-        <w:pStyle w:val="Heading3"/>
-      </w:pPr>
-      <w:bookmarkStart w:id="21" w:name="_Toc242745154"/>
-      <w:r>
-        <w:t>Gestão de Utilizadores</w:t>
-      </w:r>
-      <w:bookmarkEnd w:id="21"/>
-    </w:p>
-    <w:p>
-      <w:r>
-        <w:t>A gestão de utilizadores permite criar, editar e remover contas, bem como atribuir perfis de acesso. Cada utilizador dispõe de uma configuração pessoal e de um perfil com a respetiva fotografia e histórico de atividade.</w:t>
+        <w:t>Figura 12: Ecrã de bloqueio da aplicação.</w:t>
       </w:r>
     </w:p>
     <w:p>
@@ -3150,11 +3036,10 @@
         <w:rPr>
           <w:noProof/>
         </w:rPr>
-        <w:lastRenderedPageBreak/>
         <w:drawing>
-          <wp:inline distT="0" distB="0" distL="0" distR="0" wp14:anchorId="1E5648AD" wp14:editId="318D72E2">
-            <wp:extent cx="5176516" cy="2738628"/>
-            <wp:effectExtent l="0" t="0" r="5715" b="5080"/>
+          <wp:inline distT="0" distB="0" distL="0" distR="0" wp14:anchorId="2B954616" wp14:editId="33E5AE3D">
+            <wp:extent cx="5176916" cy="3686220"/>
+            <wp:effectExtent l="0" t="0" r="5080" b="0"/>
             <wp:docPr id="13" name="Picture 13"/>
             <wp:cNvGraphicFramePr>
               <a:graphicFrameLocks xmlns:a="http://schemas.openxmlformats.org/drawingml/2006/main" noChangeAspect="1"/>
@@ -3167,7 +3052,7 @@
                     <pic:cNvPicPr/>
                   </pic:nvPicPr>
                   <pic:blipFill>
-                    <a:blip r:embed="rId24" cstate="print">
+                    <a:blip r:embed="rId24">
                       <a:extLst>
                         <a:ext uri="{28A0092B-C50C-407E-A947-70E740481C1C}">
                           <a14:useLocalDpi xmlns:a14="http://schemas.microsoft.com/office/drawing/2010/main" val="0"/>
@@ -3181,7 +3066,7 @@
                   <pic:spPr>
                     <a:xfrm>
                       <a:off x="0" y="0"/>
-                      <a:ext cx="5176516" cy="2738628"/>
+                      <a:ext cx="5176916" cy="3686220"/>
                     </a:xfrm>
                     <a:prstGeom prst="rect">
                       <a:avLst/>
@@ -3199,7 +3084,7 @@
         <w:pStyle w:val="Caption"/>
       </w:pPr>
       <w:r>
-        <w:t>Figura 13: Gestão de utilizadores.</w:t>
+        <w:t>Figura 13: Janela de informação sobre a aplicação.</w:t>
       </w:r>
     </w:p>
     <w:p>
@@ -3211,12 +3096,15 @@
         <w:rPr>
           <w:noProof/>
         </w:rPr>
+        <w:lastRenderedPageBreak/>
         <w:drawing>
-          <wp:inline distT="0" distB="0" distL="0" distR="0" wp14:anchorId="1671A8C4" wp14:editId="583B1983">
-            <wp:extent cx="4603987" cy="2933851"/>
-            <wp:effectExtent l="0" t="0" r="6350" b="0"/>
+          <wp:inline distT="0" distB="0" distL="0" distR="0" wp14:anchorId="52AE79A2" wp14:editId="013B6814">
+            <wp:extent cx="5177208" cy="4294269"/>
+            <wp:effectExtent l="0" t="0" r="4445" b="0"/>
             <wp:docPr id="14" name="Picture 14"/>
-            <wp:cNvGraphicFramePr/>
+            <wp:cNvGraphicFramePr>
+              <a:graphicFrameLocks xmlns:a="http://schemas.openxmlformats.org/drawingml/2006/main" noChangeAspect="1"/>
+            </wp:cNvGraphicFramePr>
             <a:graphic xmlns:a="http://schemas.openxmlformats.org/drawingml/2006/main">
               <a:graphicData uri="http://schemas.openxmlformats.org/drawingml/2006/picture">
                 <pic:pic xmlns:pic="http://schemas.openxmlformats.org/drawingml/2006/picture">
@@ -3239,7 +3127,7 @@
                   <pic:spPr>
                     <a:xfrm>
                       <a:off x="0" y="0"/>
-                      <a:ext cx="4603987" cy="2933851"/>
+                      <a:ext cx="5177208" cy="4294269"/>
                     </a:xfrm>
                     <a:prstGeom prst="rect">
                       <a:avLst/>
@@ -3257,7 +3145,7 @@
         <w:pStyle w:val="Caption"/>
       </w:pPr>
       <w:r>
-        <w:t>Figura 14: Configuração de um utilizador.</w:t>
+        <w:t>Figura 14: Diálogo de alteração de palavra-passe.</w:t>
       </w:r>
     </w:p>
     <w:p>
@@ -3269,13 +3157,14 @@
         <w:rPr>
           <w:noProof/>
         </w:rPr>
-        <w:lastRenderedPageBreak/>
         <w:drawing>
-          <wp:inline distT="0" distB="0" distL="0" distR="0" wp14:anchorId="11A03940" wp14:editId="54AD9C50">
-            <wp:extent cx="3810196" cy="3613336"/>
-            <wp:effectExtent l="0" t="0" r="0" b="6350"/>
+          <wp:inline distT="0" distB="0" distL="0" distR="0" wp14:anchorId="5ED87777" wp14:editId="45907029">
+            <wp:extent cx="5176761" cy="3300320"/>
+            <wp:effectExtent l="0" t="0" r="5080" b="0"/>
             <wp:docPr id="15" name="Picture 15"/>
-            <wp:cNvGraphicFramePr/>
+            <wp:cNvGraphicFramePr>
+              <a:graphicFrameLocks xmlns:a="http://schemas.openxmlformats.org/drawingml/2006/main" noChangeAspect="1"/>
+            </wp:cNvGraphicFramePr>
             <a:graphic xmlns:a="http://schemas.openxmlformats.org/drawingml/2006/main">
               <a:graphicData uri="http://schemas.openxmlformats.org/drawingml/2006/picture">
                 <pic:pic xmlns:pic="http://schemas.openxmlformats.org/drawingml/2006/picture">
@@ -3298,7 +3187,7 @@
                   <pic:spPr>
                     <a:xfrm>
                       <a:off x="0" y="0"/>
-                      <a:ext cx="3810196" cy="3613336"/>
+                      <a:ext cx="5176761" cy="3300320"/>
                     </a:xfrm>
                     <a:prstGeom prst="rect">
                       <a:avLst/>
@@ -3316,22 +3205,7 @@
         <w:pStyle w:val="Caption"/>
       </w:pPr>
       <w:r>
-        <w:t>Figura 15: Perfil de utilizador com histórico de atividade.</w:t>
-      </w:r>
-    </w:p>
-    <w:p>
-      <w:pPr>
-        <w:pStyle w:val="Heading3"/>
-      </w:pPr>
-      <w:bookmarkStart w:id="22" w:name="_Toc242745155"/>
-      <w:r>
-        <w:t>Configurações</w:t>
-      </w:r>
-      <w:bookmarkEnd w:id="22"/>
-    </w:p>
-    <w:p>
-      <w:r>
-        <w:t>O módulo de configurações permite ajustar o tema, a tipografia, o tempo de inatividade para termo automático de sessão, o agendamento das cópias de segurança e os padrões de exclusão. A alteração da palavra-passe é realizada através de um diálogo dedicado.</w:t>
+        <w:t>Figura 15: Configuração do perfil do utilizador.</w:t>
       </w:r>
     </w:p>
     <w:p>
@@ -3343,10 +3217,11 @@
         <w:rPr>
           <w:noProof/>
         </w:rPr>
+        <w:lastRenderedPageBreak/>
         <w:drawing>
-          <wp:inline distT="0" distB="0" distL="0" distR="0" wp14:anchorId="20BCF891" wp14:editId="146EB8A7">
-            <wp:extent cx="5176516" cy="2738628"/>
-            <wp:effectExtent l="0" t="0" r="5715" b="5080"/>
+          <wp:inline distT="0" distB="0" distL="0" distR="0" wp14:anchorId="786CADC5" wp14:editId="0DE6E97A">
+            <wp:extent cx="5177232" cy="7051560"/>
+            <wp:effectExtent l="0" t="0" r="4445" b="0"/>
             <wp:docPr id="16" name="Picture 16"/>
             <wp:cNvGraphicFramePr>
               <a:graphicFrameLocks xmlns:a="http://schemas.openxmlformats.org/drawingml/2006/main" noChangeAspect="1"/>
@@ -3359,7 +3234,7 @@
                     <pic:cNvPicPr/>
                   </pic:nvPicPr>
                   <pic:blipFill>
-                    <a:blip r:embed="rId27" cstate="print">
+                    <a:blip r:embed="rId27">
                       <a:extLst>
                         <a:ext uri="{28A0092B-C50C-407E-A947-70E740481C1C}">
                           <a14:useLocalDpi xmlns:a14="http://schemas.microsoft.com/office/drawing/2010/main" val="0"/>
@@ -3373,7 +3248,7 @@
                   <pic:spPr>
                     <a:xfrm>
                       <a:off x="0" y="0"/>
-                      <a:ext cx="5176516" cy="2738628"/>
+                      <a:ext cx="5177232" cy="7051560"/>
                     </a:xfrm>
                     <a:prstGeom prst="rect">
                       <a:avLst/>
@@ -3391,7 +3266,22 @@
         <w:pStyle w:val="Caption"/>
       </w:pPr>
       <w:r>
-        <w:t>Figura 16: Ecrã de configurações.</w:t>
+        <w:t>Figura 16: Configuração dos parâmetros de um servidor.</w:t>
+      </w:r>
+    </w:p>
+    <w:p>
+      <w:pPr>
+        <w:pStyle w:val="Heading2"/>
+      </w:pPr>
+      <w:bookmarkStart w:id="24" w:name="_Toc242749290"/>
+      <w:r>
+        <w:t>13. Dados protegidos e exploração de ficheiros</w:t>
+      </w:r>
+      <w:bookmarkEnd w:id="24"/>
+    </w:p>
+    <w:p>
+      <w:r>
+        <w:t>Por razões de segurança, determinadas operações exigem a apresentação da chave mestra da aplicação. Complementarmente, um explorador de ficheiros permite navegar no sistema de ficheiros de forma integrada, e o perfil do utilizador reúne a sua informação pessoal e o histórico de atividade.</w:t>
       </w:r>
     </w:p>
     <w:p>
@@ -3405,11 +3295,13 @@
         </w:rPr>
         <w:lastRenderedPageBreak/>
         <w:drawing>
-          <wp:inline distT="0" distB="0" distL="0" distR="0" wp14:anchorId="3676EF7A" wp14:editId="78B5C6E1">
-            <wp:extent cx="3016405" cy="2502029"/>
-            <wp:effectExtent l="0" t="0" r="0" b="0"/>
+          <wp:inline distT="0" distB="0" distL="0" distR="0" wp14:anchorId="3837905D" wp14:editId="0598564E">
+            <wp:extent cx="5176775" cy="3541734"/>
+            <wp:effectExtent l="0" t="0" r="5080" b="1905"/>
             <wp:docPr id="17" name="Picture 17"/>
-            <wp:cNvGraphicFramePr/>
+            <wp:cNvGraphicFramePr>
+              <a:graphicFrameLocks xmlns:a="http://schemas.openxmlformats.org/drawingml/2006/main" noChangeAspect="1"/>
+            </wp:cNvGraphicFramePr>
             <a:graphic xmlns:a="http://schemas.openxmlformats.org/drawingml/2006/main">
               <a:graphicData uri="http://schemas.openxmlformats.org/drawingml/2006/picture">
                 <pic:pic xmlns:pic="http://schemas.openxmlformats.org/drawingml/2006/picture">
@@ -3432,7 +3324,7 @@
                   <pic:spPr>
                     <a:xfrm>
                       <a:off x="0" y="0"/>
-                      <a:ext cx="3016405" cy="2502029"/>
+                      <a:ext cx="5176775" cy="3541734"/>
                     </a:xfrm>
                     <a:prstGeom prst="rect">
                       <a:avLst/>
@@ -3450,22 +3342,7 @@
         <w:pStyle w:val="Caption"/>
       </w:pPr>
       <w:r>
-        <w:t>Figura 17: Diálogo de alteração de palavra-passe.</w:t>
-      </w:r>
-    </w:p>
-    <w:p>
-      <w:pPr>
-        <w:pStyle w:val="Heading3"/>
-      </w:pPr>
-      <w:bookmarkStart w:id="23" w:name="_Toc242745156"/>
-      <w:r>
-        <w:t>Explorador de Ficheiros</w:t>
-      </w:r>
-      <w:bookmarkEnd w:id="23"/>
-    </w:p>
-    <w:p>
-      <w:r>
-        <w:t>O explorador de ficheiros permite navegar pela estrutura de diretórios, selecionar ficheiros e pastas e efetuar operações de sincronização sobre a seleção efetuada.</w:t>
+        <w:t>Figura 17: Pedido de introdução da chave mestra.</w:t>
       </w:r>
     </w:p>
     <w:p>
@@ -3478,7 +3355,7 @@
           <w:noProof/>
         </w:rPr>
         <w:drawing>
-          <wp:inline distT="0" distB="0" distL="0" distR="0" wp14:anchorId="6DCB43DC" wp14:editId="0FF1AA09">
+          <wp:inline distT="0" distB="0" distL="0" distR="0" wp14:anchorId="47C89BCC" wp14:editId="48375058">
             <wp:extent cx="5176604" cy="3144997"/>
             <wp:effectExtent l="0" t="0" r="5080" b="0"/>
             <wp:docPr id="18" name="Picture 18"/>
@@ -3525,22 +3402,7 @@
         <w:pStyle w:val="Caption"/>
       </w:pPr>
       <w:r>
-        <w:t>Figura 18: Explorador de ficheiros.</w:t>
-      </w:r>
-    </w:p>
-    <w:p>
-      <w:pPr>
-        <w:pStyle w:val="Heading3"/>
-      </w:pPr>
-      <w:bookmarkStart w:id="24" w:name="_Toc242745157"/>
-      <w:r>
-        <w:t>Diálogos Auxiliares</w:t>
-      </w:r>
-      <w:bookmarkEnd w:id="24"/>
-    </w:p>
-    <w:p>
-      <w:r>
-        <w:t>Completam a aplicação vários diálogos de apoio, como a janela de informação sobre o sistema, que apresenta a versão, a licença e os autores do projeto.</w:t>
+        <w:t>Figura 18: Explorador de ficheiros da aplicação.</w:t>
       </w:r>
     </w:p>
     <w:p>
@@ -3554,11 +3416,13 @@
         </w:rPr>
         <w:lastRenderedPageBreak/>
         <w:drawing>
-          <wp:inline distT="0" distB="0" distL="0" distR="0" wp14:anchorId="2BB8D475" wp14:editId="5CC4FC1B">
-            <wp:extent cx="3175163" cy="2260716"/>
-            <wp:effectExtent l="0" t="0" r="6350" b="6350"/>
+          <wp:inline distT="0" distB="0" distL="0" distR="0" wp14:anchorId="1B422787" wp14:editId="06FC51C2">
+            <wp:extent cx="5217720" cy="4945239"/>
+            <wp:effectExtent l="0" t="0" r="2540" b="8255"/>
             <wp:docPr id="19" name="Picture 19"/>
-            <wp:cNvGraphicFramePr/>
+            <wp:cNvGraphicFramePr>
+              <a:graphicFrameLocks xmlns:a="http://schemas.openxmlformats.org/drawingml/2006/main" noChangeAspect="1"/>
+            </wp:cNvGraphicFramePr>
             <a:graphic xmlns:a="http://schemas.openxmlformats.org/drawingml/2006/main">
               <a:graphicData uri="http://schemas.openxmlformats.org/drawingml/2006/picture">
                 <pic:pic xmlns:pic="http://schemas.openxmlformats.org/drawingml/2006/picture">
@@ -3581,7 +3445,7 @@
                   <pic:spPr>
                     <a:xfrm>
                       <a:off x="0" y="0"/>
-                      <a:ext cx="3175163" cy="2260716"/>
+                      <a:ext cx="5217720" cy="4945239"/>
                     </a:xfrm>
                     <a:prstGeom prst="rect">
                       <a:avLst/>
@@ -3599,7 +3463,7 @@
         <w:pStyle w:val="Caption"/>
       </w:pPr>
       <w:r>
-        <w:t>Figura 19: Janela de informação sobre o sistema.</w:t>
+        <w:t>Figura 19: Perfil do utilizador com o histórico de atividade.</w:t>
       </w:r>
     </w:p>
     <w:p>
@@ -3615,26 +3479,26 @@
       <w:pPr>
         <w:pStyle w:val="Heading1"/>
       </w:pPr>
-      <w:bookmarkStart w:id="25" w:name="_Toc242745158"/>
+      <w:bookmarkStart w:id="25" w:name="_Toc242749291"/>
       <w:r>
         <w:lastRenderedPageBreak/>
-        <w:t>Conclusão</w:t>
+        <w:t>IV. Conclusão</w:t>
       </w:r>
       <w:bookmarkEnd w:id="25"/>
     </w:p>
     <w:p>
       <w:r>
-        <w:t>O desenvolvimento do DataSyncEngine permitiu concretizar uma aplicação de ambiente de trabalho capaz de sincronizar, gerir e salvaguardar dados entre múltiplos servidores, integrando autenticação, auditoria, cópia de segurança e gestão de utilizadores numa interface moderna e consistente. Os objetivos inicialmente propostos foram cumpridos, tendo-se obtido um sistema funcional, seguro e de utilização intuitiva.</w:t>
-      </w:r>
-    </w:p>
-    <w:p>
-      <w:r>
-        <w:t>Ao longo do projeto foi possível aplicar e aprofundar conhecimentos em várias áreas, desde a programação orientada a objetos e a programação assíncrona até à modelação de bases de dados, à segurança de credenciais e ao desenho de interfaces. A adoção de uma arquitetura em camadas revelou-se decisiva para a organização do código e para a facilidade de manutenção.</w:t>
-      </w:r>
-    </w:p>
-    <w:p>
-      <w:r>
-        <w:t>Como trabalho futuro, prevê-se a implementação de sincronização em tempo real através de mecanismos de observação de alterações em disco, o suporte a protocolos de transferência remota adicionais e a disponibilização de relatórios exportáveis em formato PDF. Perspetiva-se ainda o desenvolvimento de testes automatizados que reforcem a robustez e a fiabilidade da aplicação.</w:t>
+        <w:t>O projeto permitiu concretizar uma aplicação de sincronização de dados entre servidores com recurso a uma interface gráfica coerente e a um conjunto de funcionalidades que respondem aos objetivos definidos. A separação em camadas, o agendamento das tarefas, as cópias de segurança e o registo de auditoria garantem que as operações são efetuadas de forma controlada e passível de verificação.</w:t>
+      </w:r>
+    </w:p>
+    <w:p>
+      <w:r>
+        <w:t>O desenvolvimento evidenciou ainda a importância de conciliar a segurança com a simplicidade de utilização. As opções tomadas, nomeadamente a autenticação por perfis, o bloqueio automático da sessão e a encriptação, elevam o nível de proteção dos dados sem tornar a aplicação mais difícil de operar.</w:t>
+      </w:r>
+    </w:p>
+    <w:p>
+      <w:r>
+        <w:t>Como trabalho futuro, admite-se a extensão do sistema a outros tipos de bases de dados, a possibilidade de sincronização em tempo real por monitorização contínua das alterações e o aperfeiçoamento do tratamento automático de conflitos entre versões.</w:t>
       </w:r>
     </w:p>
     <w:p>
@@ -3650,7 +3514,7 @@
       <w:pPr>
         <w:pStyle w:val="Heading1"/>
       </w:pPr>
-      <w:bookmarkStart w:id="26" w:name="_Toc242745159"/>
+      <w:bookmarkStart w:id="26" w:name="_Toc242749292"/>
       <w:r>
         <w:lastRenderedPageBreak/>
         <w:t>Referências Bibliográficas</w:t>
@@ -3663,7 +3527,7 @@
         <w:jc w:val="left"/>
       </w:pPr>
       <w:r>
-        <w:t>TANENBAUM, A. S.; VAN STEEN, M. — Distributed Systems: Principles and Paradigms. 3.ª edição. Pearson, 2017.</w:t>
+        <w:t>TANENBAUM, A. S.; VAN STEEN, M. Distributed Systems: Principles and Paradigms. 2.ª ed. Upper Saddle River: Prentice Hall, 2007.</w:t>
       </w:r>
     </w:p>
     <w:p>
@@ -3672,7 +3536,7 @@
         <w:jc w:val="left"/>
       </w:pPr>
       <w:r>
-        <w:t>OWASP FOUNDATION — OWASP Top 10: The Ten Most Critical Web Application Security Risks. 2021.</w:t>
+        <w:t>MICROSOFT. Documentação do .NET: Windows Forms. Disponível em: https://learn.microsoft.com/dotnet/desktop/winforms. Acesso em: 2026.</w:t>
       </w:r>
     </w:p>
     <w:p>
@@ -3681,7 +3545,7 @@
         <w:jc w:val="left"/>
       </w:pPr>
       <w:r>
-        <w:t>MICROSOFT — .NET Documentation. Microsoft Learn, 2026. Disponível em: https://learn.microsoft.com/dotnet.</w:t>
+        <w:t>COMPONENT FACTORY. Krypton Toolkit Documentation. Disponível em: https://github.com/ComponentFactory/Krypton. Acesso em: 2026.</w:t>
       </w:r>
     </w:p>
     <w:p>
@@ -3690,7 +3554,7 @@
         <w:jc w:val="left"/>
       </w:pPr>
       <w:r>
-        <w:t>ORACLE CORPORATION — MySQL 8.0 Reference Manual. Oracle, 2026. Disponível em: https://dev.mysql.com/doc.</w:t>
+        <w:t>ORACLE. MySQL 8.0 Reference Manual. Disponível em: https://dev.mysql.com/doc/refman/8.0/en/. Acesso em: 2026.</w:t>
       </w:r>
     </w:p>
     <w:p>
@@ -3699,25 +3563,7 @@
         <w:jc w:val="left"/>
       </w:pPr>
       <w:r>
-        <w:t>KRYPTON SUITE — Standard Toolkit for Windows Forms. Component Factory, 2026. Disponível em: https://github.com/ComponentFactory/Krypton.</w:t>
-      </w:r>
-    </w:p>
-    <w:p>
-      <w:pPr>
-        <w:ind w:left="560" w:hanging="560"/>
-        <w:jc w:val="left"/>
-      </w:pPr>
-      <w:r>
-        <w:t>FOWLER, M. — Patterns of Enterprise Application Architecture. Addison-Wesley, 2002.</w:t>
-      </w:r>
-    </w:p>
-    <w:p>
-      <w:pPr>
-        <w:ind w:left="560" w:hanging="560"/>
-        <w:jc w:val="left"/>
-      </w:pPr>
-      <w:r>
-        <w:t>PROJECT MANAGEMENT INSTITUTE — A Guide to the Project Management Body of Knowledge (PMBOK Guide). 7.ª edição. PMI, 2021.</w:t>
+        <w:t>STALLINGS, W. Cryptography and Network Security: Principles and Practice. 7.ª ed. London: Pearson, 2016.</w:t>
       </w:r>
     </w:p>
     <w:p>
@@ -3797,7 +3643,28 @@
   <w:p>
     <w:pPr>
       <w:pStyle w:val="Footer"/>
+      <w:tabs>
+        <w:tab w:val="clear" w:pos="4252"/>
+        <w:tab w:val="clear" w:pos="8504"/>
+        <w:tab w:val="right" w:pos="9070"/>
+      </w:tabs>
+      <w:jc w:val="left"/>
+      <w:rPr>
+        <w:sz w:val="22"/>
+      </w:rPr>
     </w:pPr>
+    <w:r>
+      <w:rPr>
+        <w:sz w:val="22"/>
+      </w:rPr>
+      <w:t>Programação Visual</w:t>
+    </w:r>
+    <w:r>
+      <w:rPr>
+        <w:sz w:val="22"/>
+      </w:rPr>
+      <w:tab/>
+    </w:r>
     <w:r>
       <w:rPr>
         <w:sz w:val="22"/>
@@ -4324,7 +4191,7 @@
     <w:link w:val="Heading1Char"/>
     <w:uiPriority w:val="9"/>
     <w:qFormat/>
-    <w:rsid w:val="00E67FD7"/>
+    <w:rsid w:val="004B57EB"/>
     <w:pPr>
       <w:keepNext/>
       <w:keepLines/>
@@ -4348,7 +4215,7 @@
     <w:uiPriority w:val="9"/>
     <w:unhideWhenUsed/>
     <w:qFormat/>
-    <w:rsid w:val="00E67FD7"/>
+    <w:rsid w:val="004B57EB"/>
     <w:pPr>
       <w:keepNext/>
       <w:keepLines/>
@@ -4372,7 +4239,7 @@
     <w:uiPriority w:val="9"/>
     <w:unhideWhenUsed/>
     <w:qFormat/>
-    <w:rsid w:val="00E67FD7"/>
+    <w:rsid w:val="004B57EB"/>
     <w:pPr>
       <w:keepNext/>
       <w:keepLines/>
@@ -4419,7 +4286,7 @@
     <w:basedOn w:val="DefaultParagraphFont"/>
     <w:link w:val="Heading1"/>
     <w:uiPriority w:val="9"/>
-    <w:rsid w:val="00E67FD7"/>
+    <w:rsid w:val="004B57EB"/>
     <w:rPr>
       <w:rFonts w:ascii="Times New Roman" w:eastAsiaTheme="majorEastAsia" w:hAnsi="Times New Roman" w:cs="Times New Roman"/>
       <w:b/>
@@ -4433,7 +4300,7 @@
     <w:basedOn w:val="DefaultParagraphFont"/>
     <w:link w:val="Heading2"/>
     <w:uiPriority w:val="9"/>
-    <w:rsid w:val="00E67FD7"/>
+    <w:rsid w:val="004B57EB"/>
     <w:rPr>
       <w:rFonts w:ascii="Times New Roman" w:eastAsiaTheme="majorEastAsia" w:hAnsi="Times New Roman" w:cs="Times New Roman"/>
       <w:b/>
@@ -4447,7 +4314,7 @@
     <w:basedOn w:val="DefaultParagraphFont"/>
     <w:link w:val="Heading3"/>
     <w:uiPriority w:val="9"/>
-    <w:rsid w:val="00E67FD7"/>
+    <w:rsid w:val="004B57EB"/>
     <w:rPr>
       <w:rFonts w:ascii="Times New Roman" w:eastAsiaTheme="majorEastAsia" w:hAnsi="Times New Roman" w:cs="Times New Roman"/>
       <w:b/>
@@ -4463,7 +4330,7 @@
     <w:uiPriority w:val="35"/>
     <w:unhideWhenUsed/>
     <w:qFormat/>
-    <w:rsid w:val="00E67FD7"/>
+    <w:rsid w:val="004B57EB"/>
     <w:pPr>
       <w:spacing w:after="240" w:line="240" w:lineRule="auto"/>
       <w:jc w:val="center"/>
@@ -4483,7 +4350,7 @@
     <w:autoRedefine/>
     <w:uiPriority w:val="39"/>
     <w:unhideWhenUsed/>
-    <w:rsid w:val="00E67FD7"/>
+    <w:rsid w:val="004B57EB"/>
     <w:pPr>
       <w:spacing w:after="0" w:line="240" w:lineRule="auto"/>
       <w:jc w:val="left"/>
@@ -4496,7 +4363,7 @@
     <w:autoRedefine/>
     <w:uiPriority w:val="39"/>
     <w:unhideWhenUsed/>
-    <w:rsid w:val="00E67FD7"/>
+    <w:rsid w:val="004B57EB"/>
     <w:pPr>
       <w:spacing w:after="0" w:line="240" w:lineRule="auto"/>
       <w:ind w:left="240"/>
@@ -4513,7 +4380,7 @@
     <w:autoRedefine/>
     <w:uiPriority w:val="39"/>
     <w:unhideWhenUsed/>
-    <w:rsid w:val="00E67FD7"/>
+    <w:rsid w:val="004B57EB"/>
     <w:pPr>
       <w:spacing w:after="0" w:line="240" w:lineRule="auto"/>
       <w:ind w:left="480"/>
@@ -4529,7 +4396,7 @@
     <w:link w:val="HeaderChar"/>
     <w:uiPriority w:val="99"/>
     <w:unhideWhenUsed/>
-    <w:rsid w:val="00E67FD7"/>
+    <w:rsid w:val="004B57EB"/>
     <w:pPr>
       <w:tabs>
         <w:tab w:val="center" w:pos="4252"/>
@@ -4543,7 +4410,7 @@
     <w:basedOn w:val="DefaultParagraphFont"/>
     <w:link w:val="Header"/>
     <w:uiPriority w:val="99"/>
-    <w:rsid w:val="00E67FD7"/>
+    <w:rsid w:val="004B57EB"/>
     <w:rPr>
       <w:rFonts w:ascii="Times New Roman" w:hAnsi="Times New Roman" w:cs="Times New Roman"/>
       <w:sz w:val="24"/>
@@ -4555,7 +4422,7 @@
     <w:link w:val="FooterChar"/>
     <w:uiPriority w:val="99"/>
     <w:unhideWhenUsed/>
-    <w:rsid w:val="00E67FD7"/>
+    <w:rsid w:val="004B57EB"/>
     <w:pPr>
       <w:tabs>
         <w:tab w:val="center" w:pos="4252"/>
@@ -4569,7 +4436,7 @@
     <w:basedOn w:val="DefaultParagraphFont"/>
     <w:link w:val="Footer"/>
     <w:uiPriority w:val="99"/>
-    <w:rsid w:val="00E67FD7"/>
+    <w:rsid w:val="004B57EB"/>
     <w:rPr>
       <w:rFonts w:ascii="Times New Roman" w:hAnsi="Times New Roman" w:cs="Times New Roman"/>
       <w:sz w:val="24"/>

</xml_diff>